<commit_message>
feat: complete implementation of forward indicators, trigger engine, history persistence, and methodology doc
</commit_message>
<xml_diff>
--- a/Analyza_Dat_a_Metodika_SuggestInvest.docx
+++ b/Analyza_Dat_a_Metodika_SuggestInvest.docx
@@ -41,7 +41,7 @@
           <w:color w:val="64748B"/>
           <w:sz w:val="26"/>
         </w:rPr>
-        <w:t>Kompletní přehled datových zdrojů, analytických proměnných a principu vyhodnocování 513 akciových titulů a ETF</w:t>
+        <w:t>Kompletní přehled datových zdrojů, analytických proměnných a principu vyhodnocování 541 akciových titulů a ETF</w:t>
       </w:r>
     </w:p>
     <w:tbl>
@@ -82,7 +82,7 @@
               <w:rPr>
                 <w:sz w:val="19"/>
               </w:rPr>
-              <w:t>513 aktiv (US akcie, Evropa, BCPP v CZK, ETF, Krypto)</w:t>
+              <w:t>541 aktiv (US akcie, Evropa, BCPP v CZK, ETF, Krypto)</w:t>
             </w:r>
           </w:p>
         </w:tc>
@@ -1559,7 +1559,7 @@
           <w:color w:val="0F172A"/>
           <w:sz w:val="34"/>
         </w:rPr>
-        <w:t>6. Segmentace univerza: Proč 3 prioritní koše (Tiers)</w:t>
+        <w:t>6. Předstihové indikátory, cílové ceny a firemní kalendáře</w:t>
       </w:r>
     </w:p>
     <w:p>
@@ -1572,7 +1572,410 @@
           <w:color w:val="1E293B"/>
           <w:sz w:val="21"/>
         </w:rPr>
-        <w:t>Všech 513 aktiv je kategorizováno do 3 logických košů, které umožňují okamžité filtrování podle investičního stylu:</w:t>
+        <w:t>Klíčovým inovačním skokem systému SuggestInvest je integrace předstihových (forward-looking) indikátorů. Zatímco běžné skenery pouze reaktivně sledují včerejší ceny a denní změny, SuggestInvest se dívá dopředu pomocí konsenzuálních cílových cen analytiků, odpočtu dnů do kvartálních výsledků a časových momentových delt.</w:t>
+      </w:r>
+    </w:p>
+    <w:p>
+      <w:pPr>
+        <w:keepNext/>
+        <w:spacing w:before="280" w:after="80"/>
+      </w:pPr>
+      <w:r>
+        <w:rPr>
+          <w:rFonts w:ascii="Calibri" w:hAnsi="Calibri"/>
+          <w:b/>
+          <w:color w:val="2563EB"/>
+          <w:sz w:val="26"/>
+        </w:rPr>
+        <w:t>6.1 Cílové ceny analytiků a růstový potenciál (Target Upside %)</w:t>
+      </w:r>
+    </w:p>
+    <w:p>
+      <w:pPr>
+        <w:spacing w:before="0" w:after="120" w:line="276" w:lineRule="auto"/>
+      </w:pPr>
+      <w:r>
+        <w:rPr>
+          <w:rFonts w:ascii="Calibri" w:hAnsi="Calibri"/>
+          <w:color w:val="1E293B"/>
+          <w:sz w:val="21"/>
+        </w:rPr>
+        <w:t>Pro každý akciový titul systém stahuje konsenzuální odhad analytiků z Wall Street (Target Mean Price, Target High a Target Low) včetně počtu analytiků pokrývajících danou akcii. Následně počítá přesný diskont či prémii vůči trhu:</w:t>
+      </w:r>
+    </w:p>
+    <w:p>
+      <w:pPr>
+        <w:pStyle w:val="ListBullet"/>
+        <w:spacing w:before="0" w:after="60" w:line="276" w:lineRule="auto"/>
+      </w:pPr>
+      <w:r>
+        <w:rPr>
+          <w:rFonts w:ascii="Calibri" w:hAnsi="Calibri"/>
+          <w:b/>
+          <w:color w:val="1E293B"/>
+          <w:sz w:val="21"/>
+        </w:rPr>
+        <w:t>Vzorec Target Upside %:</w:t>
+      </w:r>
+      <w:r>
+        <w:rPr>
+          <w:rFonts w:ascii="Calibri" w:hAnsi="Calibri"/>
+          <w:color w:val="1E293B"/>
+          <w:sz w:val="21"/>
+        </w:rPr>
+        <w:t xml:space="preserve"> (Target Mean Price - Aktuální cena) / Aktuální cena × 100.</w:t>
+      </w:r>
+    </w:p>
+    <w:p>
+      <w:pPr>
+        <w:pStyle w:val="ListBullet"/>
+        <w:spacing w:before="0" w:after="60" w:line="276" w:lineRule="auto"/>
+      </w:pPr>
+      <w:r>
+        <w:rPr>
+          <w:rFonts w:ascii="Calibri" w:hAnsi="Calibri"/>
+          <w:b/>
+          <w:color w:val="1E293B"/>
+          <w:sz w:val="21"/>
+        </w:rPr>
+        <w:t>🎯 Vysoký diskont (&gt; +25 %):</w:t>
+      </w:r>
+      <w:r>
+        <w:rPr>
+          <w:rFonts w:ascii="Calibri" w:hAnsi="Calibri"/>
+          <w:color w:val="1E293B"/>
+          <w:sz w:val="21"/>
+        </w:rPr>
+        <w:t xml:space="preserve"> Pokud je očekávaný růst k cíli &gt; +25 % při alespoň 5 analytických doporučeních.</w:t>
+      </w:r>
+    </w:p>
+    <w:p>
+      <w:pPr>
+        <w:pStyle w:val="ListBullet"/>
+        <w:spacing w:before="0" w:after="60" w:line="276" w:lineRule="auto"/>
+      </w:pPr>
+      <w:r>
+        <w:rPr>
+          <w:rFonts w:ascii="Calibri" w:hAnsi="Calibri"/>
+          <w:b/>
+          <w:color w:val="1E293B"/>
+          <w:sz w:val="21"/>
+        </w:rPr>
+        <w:t>⚠️ Nad cílem analytiků:</w:t>
+      </w:r>
+      <w:r>
+        <w:rPr>
+          <w:rFonts w:ascii="Calibri" w:hAnsi="Calibri"/>
+          <w:color w:val="1E293B"/>
+          <w:sz w:val="21"/>
+        </w:rPr>
+        <w:t xml:space="preserve"> Pokud aktuální tržní cena překročila průměrný cíl analytiků (varování před vyčerpaným potenciálem).</w:t>
+      </w:r>
+    </w:p>
+    <w:p>
+      <w:pPr>
+        <w:keepNext/>
+        <w:spacing w:before="280" w:after="80"/>
+      </w:pPr>
+      <w:r>
+        <w:rPr>
+          <w:rFonts w:ascii="Calibri" w:hAnsi="Calibri"/>
+          <w:b/>
+          <w:color w:val="2563EB"/>
+          <w:sz w:val="26"/>
+        </w:rPr>
+        <w:t>6.2 Firemní kalendáře: Kvartální výsledky a odpočet dní (Earnings Countdown)</w:t>
+      </w:r>
+    </w:p>
+    <w:p>
+      <w:pPr>
+        <w:spacing w:before="0" w:after="120" w:line="276" w:lineRule="auto"/>
+      </w:pPr>
+      <w:r>
+        <w:rPr>
+          <w:rFonts w:ascii="Calibri" w:hAnsi="Calibri"/>
+          <w:color w:val="1E293B"/>
+          <w:sz w:val="21"/>
+        </w:rPr>
+        <w:t>Zveřejnění kvartálních hospodářských výsledků (Earnings) je pro akcie nejvýznamnější událostí způsobující skokové pohyby kurzu. Systém v reálném čase sleduje oficiální firemní kalendáře a počítá odpočet dní do nejbližšího reportu:</w:t>
+      </w:r>
+    </w:p>
+    <w:p>
+      <w:pPr>
+        <w:pStyle w:val="ListBullet"/>
+        <w:spacing w:before="0" w:after="60" w:line="276" w:lineRule="auto"/>
+      </w:pPr>
+      <w:r>
+        <w:rPr>
+          <w:rFonts w:ascii="Calibri" w:hAnsi="Calibri"/>
+          <w:b/>
+          <w:color w:val="1E293B"/>
+          <w:sz w:val="21"/>
+        </w:rPr>
+        <w:t>⏳ Výsledky do 7 dní (Kritické):</w:t>
+      </w:r>
+      <w:r>
+        <w:rPr>
+          <w:rFonts w:ascii="Calibri" w:hAnsi="Calibri"/>
+          <w:color w:val="1E293B"/>
+          <w:sz w:val="21"/>
+        </w:rPr>
+        <w:t xml:space="preserve"> Výsledky budou oznámeny do 7 dnů. Zvýšená implikovaná volatilita a varování před neuváženým vstupem před čísly.</w:t>
+      </w:r>
+    </w:p>
+    <w:p>
+      <w:pPr>
+        <w:pStyle w:val="ListBullet"/>
+        <w:spacing w:before="0" w:after="60" w:line="276" w:lineRule="auto"/>
+      </w:pPr>
+      <w:r>
+        <w:rPr>
+          <w:rFonts w:ascii="Calibri" w:hAnsi="Calibri"/>
+          <w:b/>
+          <w:color w:val="1E293B"/>
+          <w:sz w:val="21"/>
+        </w:rPr>
+        <w:t>📅 Výsledky do 21 dní (Blížící se):</w:t>
+      </w:r>
+      <w:r>
+        <w:rPr>
+          <w:rFonts w:ascii="Calibri" w:hAnsi="Calibri"/>
+          <w:color w:val="1E293B"/>
+          <w:sz w:val="21"/>
+        </w:rPr>
+        <w:t xml:space="preserve"> Výsledky za 8 až 21 dní. Fáze obvyklého předvýsledkového runupu či konsolidace.</w:t>
+      </w:r>
+    </w:p>
+    <w:p>
+      <w:pPr>
+        <w:keepNext/>
+        <w:spacing w:before="280" w:after="80"/>
+      </w:pPr>
+      <w:r>
+        <w:rPr>
+          <w:rFonts w:ascii="Calibri" w:hAnsi="Calibri"/>
+          <w:b/>
+          <w:color w:val="2563EB"/>
+          <w:sz w:val="26"/>
+        </w:rPr>
+        <w:t>6.3 Rozhodné dny pro dividendu (Ex-Dividend Countdown)</w:t>
+      </w:r>
+    </w:p>
+    <w:p>
+      <w:pPr>
+        <w:spacing w:before="0" w:after="120" w:line="276" w:lineRule="auto"/>
+      </w:pPr>
+      <w:r>
+        <w:rPr>
+          <w:rFonts w:ascii="Calibri" w:hAnsi="Calibri"/>
+          <w:color w:val="1E293B"/>
+          <w:sz w:val="21"/>
+        </w:rPr>
+        <w:t>Pro dividendové investory systém monitoruje datum Ex-Dividend (první den, kdy se akcie obchoduje bez nároku na dividendu). Pokud se Ex-Dividend blíží v horizontu 1 až 14 dnů, systém aktivuje zelený štítek '💰 Ex-Div za N dní' pro včasné zachycení výplaty.</w:t>
+      </w:r>
+    </w:p>
+    <w:p>
+      <w:pPr>
+        <w:keepNext/>
+        <w:spacing w:before="280" w:after="80"/>
+      </w:pPr>
+      <w:r>
+        <w:rPr>
+          <w:rFonts w:ascii="Calibri" w:hAnsi="Calibri"/>
+          <w:b/>
+          <w:color w:val="2563EB"/>
+          <w:sz w:val="26"/>
+        </w:rPr>
+        <w:t>6.4 Časové delty hybnosti: 1měsíční a 3měsíční momentum</w:t>
+      </w:r>
+    </w:p>
+    <w:p>
+      <w:pPr>
+        <w:spacing w:before="0" w:after="120" w:line="276" w:lineRule="auto"/>
+      </w:pPr>
+      <w:r>
+        <w:rPr>
+          <w:rFonts w:ascii="Calibri" w:hAnsi="Calibri"/>
+          <w:color w:val="1E293B"/>
+          <w:sz w:val="21"/>
+        </w:rPr>
+        <w:t>Kromě jednodenní změny systém hromadně vyhodnocuje střednědobé časové delty: 1M momentum (~21 obchodních dnů) a 3M momentum (~63 obchodních dnů). To umožňuje odlišit krátkodobý náhodný šum od skutečně udržitelného trendu podpořeného institucionálními toky.</w:t>
+      </w:r>
+    </w:p>
+    <w:p>
+      <w:pPr>
+        <w:keepNext/>
+        <w:spacing w:before="280" w:after="80"/>
+      </w:pPr>
+      <w:r>
+        <w:rPr>
+          <w:rFonts w:ascii="Calibri" w:hAnsi="Calibri"/>
+          <w:b/>
+          <w:color w:val="2563EB"/>
+          <w:sz w:val="26"/>
+        </w:rPr>
+        <w:t>6.5 Automatický pravidlový Trigger Engine a disková mezipaměť</w:t>
+      </w:r>
+    </w:p>
+    <w:p>
+      <w:pPr>
+        <w:spacing w:before="0" w:after="120" w:line="276" w:lineRule="auto"/>
+      </w:pPr>
+      <w:r>
+        <w:rPr>
+          <w:rFonts w:ascii="Calibri" w:hAnsi="Calibri"/>
+          <w:color w:val="1E293B"/>
+          <w:sz w:val="21"/>
+        </w:rPr>
+        <w:t>Aby systém dokázal bleskově zpracovat 541 aktiv bez rizika rate-limitu od poskytovatelů dat, využívá inteligentní souborovou mezipaměť (cache_fundamentals.json) s 24hodinovou expirací. Kalendáře a analytické cíle se tak dotazují jednou denně, zatímco kurzy běží v reálném čase. Všechny předstihové ukazatele jsou navíc přímo předávány do modelu Gemini, který je promítá do generovaného AI kontextu.</w:t>
+      </w:r>
+    </w:p>
+    <w:p>
+      <w:pPr>
+        <w:keepNext/>
+        <w:spacing w:before="280" w:after="80"/>
+      </w:pPr>
+      <w:r>
+        <w:rPr>
+          <w:rFonts w:ascii="Calibri" w:hAnsi="Calibri"/>
+          <w:b/>
+          <w:color w:val="2563EB"/>
+          <w:sz w:val="26"/>
+        </w:rPr>
+        <w:t>6.6 Dlouhodobá historická persistence a SQLite časová řada (Backtesting a audit)</w:t>
+      </w:r>
+    </w:p>
+    <w:p>
+      <w:pPr>
+        <w:spacing w:before="0" w:after="120" w:line="276" w:lineRule="auto"/>
+      </w:pPr>
+      <w:r>
+        <w:rPr>
+          <w:rFonts w:ascii="Calibri" w:hAnsi="Calibri"/>
+          <w:color w:val="1E293B"/>
+          <w:sz w:val="21"/>
+        </w:rPr>
+        <w:t>Pro zajištění plné auditovatelnosti a měření reálné úspěšnosti AI modelů v čase systém ukládá každý proběhlý sken do dvouúrovňové persistence:</w:t>
+      </w:r>
+    </w:p>
+    <w:p>
+      <w:pPr>
+        <w:pStyle w:val="ListBullet"/>
+        <w:spacing w:before="0" w:after="60" w:line="276" w:lineRule="auto"/>
+      </w:pPr>
+      <w:r>
+        <w:rPr>
+          <w:rFonts w:ascii="Calibri" w:hAnsi="Calibri"/>
+          <w:b/>
+          <w:color w:val="1E293B"/>
+          <w:sz w:val="21"/>
+        </w:rPr>
+        <w:t>1. Neměnný denní JSON Data Lake (data/history/):</w:t>
+      </w:r>
+      <w:r>
+        <w:rPr>
+          <w:rFonts w:ascii="Calibri" w:hAnsi="Calibri"/>
+          <w:color w:val="1E293B"/>
+          <w:sz w:val="21"/>
+        </w:rPr>
+        <w:t xml:space="preserve"> Každý sken vygeneruje kompletní neměnný JSON soubor se všemi 541 kartami, tržními vstupy i AI zdůvodněními.</w:t>
+      </w:r>
+    </w:p>
+    <w:p>
+      <w:pPr>
+        <w:pStyle w:val="ListBullet"/>
+        <w:spacing w:before="0" w:after="60" w:line="276" w:lineRule="auto"/>
+      </w:pPr>
+      <w:r>
+        <w:rPr>
+          <w:rFonts w:ascii="Calibri" w:hAnsi="Calibri"/>
+          <w:b/>
+          <w:color w:val="1E293B"/>
+          <w:sz w:val="21"/>
+        </w:rPr>
+        <w:t>2. Relační časová řada SQLite (history.db):</w:t>
+      </w:r>
+      <w:r>
+        <w:rPr>
+          <w:rFonts w:ascii="Calibri" w:hAnsi="Calibri"/>
+          <w:color w:val="1E293B"/>
+          <w:sz w:val="21"/>
+        </w:rPr>
+        <w:t xml:space="preserve"> Každý vydaný signál, konfidence, cena i datum kvartálních výsledků se indexují do lokální relační databáze SQLite pro bleskové analytické dotazy.</w:t>
+      </w:r>
+    </w:p>
+    <w:p>
+      <w:pPr>
+        <w:pStyle w:val="ListBullet"/>
+        <w:spacing w:before="0" w:after="60" w:line="276" w:lineRule="auto"/>
+      </w:pPr>
+      <w:r>
+        <w:rPr>
+          <w:rFonts w:ascii="Calibri" w:hAnsi="Calibri"/>
+          <w:b/>
+          <w:color w:val="1E293B"/>
+          <w:sz w:val="21"/>
+        </w:rPr>
+        <w:t>3. Automatizovaný Backtesting:</w:t>
+      </w:r>
+      <w:r>
+        <w:rPr>
+          <w:rFonts w:ascii="Calibri" w:hAnsi="Calibri"/>
+          <w:color w:val="1E293B"/>
+          <w:sz w:val="21"/>
+        </w:rPr>
+        <w:t xml:space="preserve"> Možnost ex-post porovnat vydaná doporučení (Strong Buy / Buy) se skutečným zhodnocením podkladového aktiva po 7, 30 a 90 dnech.</w:t>
+      </w:r>
+    </w:p>
+    <w:p>
+      <w:pPr>
+        <w:pStyle w:val="ListBullet"/>
+        <w:spacing w:before="0" w:after="60" w:line="276" w:lineRule="auto"/>
+      </w:pPr>
+      <w:r>
+        <w:rPr>
+          <w:rFonts w:ascii="Calibri" w:hAnsi="Calibri"/>
+          <w:b/>
+          <w:color w:val="1E293B"/>
+          <w:sz w:val="21"/>
+        </w:rPr>
+        <w:t>4. Vývoj sentimentu v čase:</w:t>
+      </w:r>
+      <w:r>
+        <w:rPr>
+          <w:rFonts w:ascii="Calibri" w:hAnsi="Calibri"/>
+          <w:color w:val="1E293B"/>
+          <w:sz w:val="21"/>
+        </w:rPr>
+        <w:t xml:space="preserve"> V AI tooltipu se přímo zobrazuje trajektorie sentimentu za poslední měsíc (např. Hold 55 % ➡️ Buy 72 % ➡️ Strong Buy 88 %).</w:t>
+      </w:r>
+    </w:p>
+    <w:p>
+      <w:pPr>
+        <w:keepNext/>
+        <w:spacing w:before="440" w:after="120"/>
+      </w:pPr>
+      <w:r>
+        <w:rPr>
+          <w:rFonts w:ascii="Calibri" w:hAnsi="Calibri"/>
+          <w:b/>
+          <w:color w:val="0F172A"/>
+          <w:sz w:val="34"/>
+        </w:rPr>
+        <w:t>7. Segmentace univerza: Proč 3 prioritní koše (Tiers)</w:t>
+      </w:r>
+    </w:p>
+    <w:p>
+      <w:pPr>
+        <w:spacing w:before="0" w:after="120" w:line="276" w:lineRule="auto"/>
+      </w:pPr>
+      <w:r>
+        <w:rPr>
+          <w:rFonts w:ascii="Calibri" w:hAnsi="Calibri"/>
+          <w:color w:val="1E293B"/>
+          <w:sz w:val="21"/>
+        </w:rPr>
+        <w:t>Všech 541 aktiv je kategorizováno do 3 logických košů, které umožňují okamžité filtrování podle investičního stylu:</w:t>
       </w:r>
     </w:p>
     <w:tbl>
@@ -1736,7 +2139,7 @@
               <w:rPr>
                 <w:sz w:val="17"/>
               </w:rPr>
-              <w:t>38 aktiv</w:t>
+              <w:t>48 aktiv</w:t>
             </w:r>
           </w:p>
         </w:tc>
@@ -1759,7 +2162,7 @@
               <w:rPr>
                 <w:sz w:val="17"/>
               </w:rPr>
-              <w:t>US Big Tech (Apple, Nvidia, Microsoft), celá BCPP v CZK (ČEZ, banky), klíčová ETF (S&amp;P 500, All-World) a Bitcoin.</w:t>
+              <w:t>US Mega-Caps (Apple, Nvidia, Microsoft, Amazon), kompletní BCPP v CZK (ČEZ, banky, Colt), evropské stálice (ASML, SAP) a klíčová indexová ETF (S&amp;P 500, All-World, Nasdaq).</w:t>
             </w:r>
           </w:p>
         </w:tc>
@@ -1782,7 +2185,7 @@
               <w:rPr>
                 <w:sz w:val="17"/>
               </w:rPr>
-              <w:t>Základní stavební kameny, nejvyšší likvidita, minimální riziko manipulace kurzu.</w:t>
+              <w:t>Základní stavební kameny, nejvyšší likvidita, globální tržní kapitalizace a minimální spread.</w:t>
             </w:r>
           </w:p>
         </w:tc>
@@ -1833,7 +2236,7 @@
               <w:rPr>
                 <w:sz w:val="17"/>
               </w:rPr>
-              <w:t>454 aktiv</w:t>
+              <w:t>472 aktiv</w:t>
             </w:r>
           </w:p>
         </w:tc>
@@ -1856,7 +2259,7 @@
               <w:rPr>
                 <w:sz w:val="17"/>
               </w:rPr>
-              <w:t>Rozšířené portfolio světových korporací (A–L), polovodiče, jaderná energetika, kosmonautika, krypto-proxies a evropští lídři.</w:t>
+              <w:t>Rozsáhlé spektrum světových blue-chips (A–Z), polovodičoví lídři, jaderná energetika, obranný sektor, kosmonautika, krypto-proxies a sektorová UCITS ETF na XTB.</w:t>
             </w:r>
           </w:p>
         </w:tc>
@@ -1879,7 +2282,7 @@
               <w:rPr>
                 <w:sz w:val="17"/>
               </w:rPr>
-              <w:t>Růstový potenciál, sektorové megatrendy a diverzifikace napříč kontinenty.</w:t>
+              <w:t>Růstový potenciál, sektorové megatrendy a diverzifikace napříč kontinenty i měnami.</w:t>
             </w:r>
           </w:p>
         </w:tc>
@@ -1999,7 +2402,7 @@
           <w:color w:val="0F172A"/>
           <w:sz w:val="34"/>
         </w:rPr>
-        <w:t>7. Závěrečné shrnutí: Přidaná hodnota pro investora</w:t>
+        <w:t>8. Závěrečné shrnutí: Přidaná hodnota pro investora</w:t>
       </w:r>
     </w:p>
     <w:p>
@@ -2012,7 +2415,7 @@
           <w:color w:val="1E293B"/>
           <w:sz w:val="21"/>
         </w:rPr>
-        <w:t>Systém SuggestInvest odstraňuje z investičního rozhodování dvě největší slabiny lidského investora: emoční zkreslení a informační zahlcení. Namísto sledování stovek protichůdných zpráv dostává investor každé ráno konzistentní, datově podložený screening trhu, který mu během několika vteřin ukáže, kde se dnes otevírají nejzajímavější příležitosti.</w:t>
+        <w:t>Systém SuggestInvest odstraňuje z investičního rozhodování dvě největší slabiny lidského investora: emoční zkreslení a informační zahlcení. Díky spojení reálných tržních dat z XTB, konsenzu analytiků, firemních kalendářů a syntézy modelu Google Gemini dostává investor každé ráno ucelený a forward-looking screening trhu, který mu během několika vteřin ukáže, kde se dnes otevírají nejzajímavější příležitosti.</w:t>
       </w:r>
     </w:p>
     <w:sectPr>

</xml_diff>

<commit_message>
feat: implement Senior Quantitative Equity Analyst & Head of Risk engine and updated methodology
</commit_message>
<xml_diff>
--- a/Analyza_Dat_a_Metodika_SuggestInvest.docx
+++ b/Analyza_Dat_a_Metodika_SuggestInvest.docx
@@ -1953,6 +1953,391 @@
     <w:p>
       <w:pPr>
         <w:keepNext/>
+        <w:spacing w:before="280" w:after="80"/>
+      </w:pPr>
+      <w:r>
+        <w:rPr>
+          <w:rFonts w:ascii="Calibri" w:hAnsi="Calibri"/>
+          <w:b/>
+          <w:color w:val="2563EB"/>
+          <w:sz w:val="26"/>
+        </w:rPr>
+        <w:t>6.7 Institucionální Kvantitativní Model a Head of Risk Rozhodovací Matice</w:t>
+      </w:r>
+    </w:p>
+    <w:p>
+      <w:pPr>
+        <w:spacing w:before="0" w:after="120" w:line="276" w:lineRule="auto"/>
+      </w:pPr>
+      <w:r>
+        <w:rPr>
+          <w:rFonts w:ascii="Calibri" w:hAnsi="Calibri"/>
+          <w:color w:val="1E293B"/>
+          <w:sz w:val="21"/>
+        </w:rPr>
+        <w:t>Vrcholnou vrstvou systému SuggestInvest je role Senior Quantitative Equity Analyst &amp; Head of Portfolio Risk. Jeho posláním není popisovat minulý vývoj kurzu, ale identifikovat asymetrické tržní příležitosti a rizika v horizontu 1 až 3 měsíců na základě nesouladu mezi tržní cenou, posunem konsenzu a časem do klíčových událostí.</w:t>
+      </w:r>
+    </w:p>
+    <w:p>
+      <w:pPr>
+        <w:spacing w:before="0" w:after="120" w:line="276" w:lineRule="auto"/>
+      </w:pPr>
+      <w:r>
+        <w:rPr>
+          <w:rFonts w:ascii="Calibri" w:hAnsi="Calibri"/>
+          <w:color w:val="1E293B"/>
+          <w:sz w:val="21"/>
+        </w:rPr>
+        <w:t>A. Pravidla konsenzu, valuace a revizí:</w:t>
+      </w:r>
+    </w:p>
+    <w:p>
+      <w:pPr>
+        <w:pStyle w:val="ListBullet"/>
+        <w:spacing w:before="0" w:after="60" w:line="276" w:lineRule="auto"/>
+      </w:pPr>
+      <w:r>
+        <w:rPr>
+          <w:rFonts w:ascii="Calibri" w:hAnsi="Calibri"/>
+          <w:b/>
+          <w:color w:val="1E293B"/>
+          <w:sz w:val="21"/>
+        </w:rPr>
+        <w:t>Fundamentální diskont (&gt; +20 %):</w:t>
+      </w:r>
+      <w:r>
+        <w:rPr>
+          <w:rFonts w:ascii="Calibri" w:hAnsi="Calibri"/>
+          <w:color w:val="1E293B"/>
+          <w:sz w:val="21"/>
+        </w:rPr>
+        <w:t xml:space="preserve"> Pokud je počet analytiků ≥ 5 a 30denní posun cílové ceny ≥ 0 %, jde o silný růstový signál (BUY / STRONG BUY). Pokud cena klesá (1M &lt; 0), ale cíl roste (Δ target 30d &gt; 0), vzniká pozitivní divergence a institucionální akumulace.</w:t>
+      </w:r>
+    </w:p>
+    <w:p>
+      <w:pPr>
+        <w:pStyle w:val="ListBullet"/>
+        <w:spacing w:before="0" w:after="60" w:line="276" w:lineRule="auto"/>
+      </w:pPr>
+      <w:r>
+        <w:rPr>
+          <w:rFonts w:ascii="Calibri" w:hAnsi="Calibri"/>
+          <w:b/>
+          <w:color w:val="1E293B"/>
+          <w:sz w:val="21"/>
+        </w:rPr>
+        <w:t>Přepálená valuace (Tržní cena nad cílem):</w:t>
+      </w:r>
+      <w:r>
+        <w:rPr>
+          <w:rFonts w:ascii="Calibri" w:hAnsi="Calibri"/>
+          <w:color w:val="1E293B"/>
+          <w:sz w:val="21"/>
+        </w:rPr>
+        <w:t xml:space="preserve"> Pokud je Target Upside ≤ 0 %, růstový potenciál je vyčerpán. Vstupuje v platnost absolutní zákaz doporučení STRONG BUY či BUY $</w:t>
+        <w:br/>
+        <w:t>ightarrow$ striktně HOLD nebo SELL.</w:t>
+      </w:r>
+    </w:p>
+    <w:p>
+      <w:pPr>
+        <w:spacing w:before="0" w:after="120" w:line="276" w:lineRule="auto"/>
+      </w:pPr>
+      <w:r>
+        <w:rPr>
+          <w:rFonts w:ascii="Calibri" w:hAnsi="Calibri"/>
+          <w:color w:val="1E293B"/>
+          <w:sz w:val="21"/>
+        </w:rPr>
+        <w:t>B. Událostní filtry kalendáře a limity konfidence:</w:t>
+      </w:r>
+    </w:p>
+    <w:p>
+      <w:pPr>
+        <w:pStyle w:val="ListBullet"/>
+        <w:spacing w:before="0" w:after="60" w:line="276" w:lineRule="auto"/>
+      </w:pPr>
+      <w:r>
+        <w:rPr>
+          <w:rFonts w:ascii="Calibri" w:hAnsi="Calibri"/>
+          <w:b/>
+          <w:color w:val="1E293B"/>
+          <w:sz w:val="21"/>
+        </w:rPr>
+        <w:t>Kritické okno před výsledky (≤ 7 dní):</w:t>
+      </w:r>
+      <w:r>
+        <w:rPr>
+          <w:rFonts w:ascii="Calibri" w:hAnsi="Calibri"/>
+          <w:color w:val="1E293B"/>
+          <w:sz w:val="21"/>
+        </w:rPr>
+        <w:t xml:space="preserve"> Implikovaná volatilita roste a událost přináší binární riziko. Konfidence nesmí překročit 65 % (s výjimkou defenzivních monopolů). Automatický štítek: ⏳ Výsledky do 7 dní.</w:t>
+      </w:r>
+    </w:p>
+    <w:p>
+      <w:pPr>
+        <w:pStyle w:val="ListBullet"/>
+        <w:spacing w:before="0" w:after="60" w:line="276" w:lineRule="auto"/>
+      </w:pPr>
+      <w:r>
+        <w:rPr>
+          <w:rFonts w:ascii="Calibri" w:hAnsi="Calibri"/>
+          <w:b/>
+          <w:color w:val="1E293B"/>
+          <w:sz w:val="21"/>
+        </w:rPr>
+        <w:t>Předvýsledkový run-up (8 až 21 dní):</w:t>
+      </w:r>
+      <w:r>
+        <w:rPr>
+          <w:rFonts w:ascii="Calibri" w:hAnsi="Calibri"/>
+          <w:color w:val="1E293B"/>
+          <w:sz w:val="21"/>
+        </w:rPr>
+        <w:t xml:space="preserve"> Pokud je 1M momentum kladné a cílová cena roste, aktivum se nachází v akumulační fázi před kvartální zprávou. Štítek: 📅 Výsledky do 21 dní.</w:t>
+      </w:r>
+    </w:p>
+    <w:p>
+      <w:pPr>
+        <w:pStyle w:val="ListBullet"/>
+        <w:spacing w:before="0" w:after="60" w:line="276" w:lineRule="auto"/>
+      </w:pPr>
+      <w:r>
+        <w:rPr>
+          <w:rFonts w:ascii="Calibri" w:hAnsi="Calibri"/>
+          <w:b/>
+          <w:color w:val="1E293B"/>
+          <w:sz w:val="21"/>
+        </w:rPr>
+        <w:t>Dividendový trigger (≤ 14 dní):</w:t>
+      </w:r>
+      <w:r>
+        <w:rPr>
+          <w:rFonts w:ascii="Calibri" w:hAnsi="Calibri"/>
+          <w:color w:val="1E293B"/>
+          <w:sz w:val="21"/>
+        </w:rPr>
+        <w:t xml:space="preserve"> Pozice je vhodná pro akumulaci před rozhodným dnem pro výplatu. Štítek: 💰 Ex-Div za N dní.</w:t>
+      </w:r>
+    </w:p>
+    <w:p>
+      <w:pPr>
+        <w:spacing w:before="0" w:after="120" w:line="276" w:lineRule="auto"/>
+      </w:pPr>
+      <w:r>
+        <w:rPr>
+          <w:rFonts w:ascii="Calibri" w:hAnsi="Calibri"/>
+          <w:color w:val="1E293B"/>
+          <w:sz w:val="21"/>
+        </w:rPr>
+        <w:t>C. Filtry trendu, obratu a řízení rizik:</w:t>
+      </w:r>
+    </w:p>
+    <w:p>
+      <w:pPr>
+        <w:pStyle w:val="ListBullet"/>
+        <w:spacing w:before="0" w:after="60" w:line="276" w:lineRule="auto"/>
+      </w:pPr>
+      <w:r>
+        <w:rPr>
+          <w:rFonts w:ascii="Calibri" w:hAnsi="Calibri"/>
+          <w:b/>
+          <w:color w:val="1E293B"/>
+          <w:sz w:val="21"/>
+        </w:rPr>
+        <w:t>Obrat vs. Padající nůž:</w:t>
+      </w:r>
+      <w:r>
+        <w:rPr>
+          <w:rFonts w:ascii="Calibri" w:hAnsi="Calibri"/>
+          <w:color w:val="1E293B"/>
+          <w:sz w:val="21"/>
+        </w:rPr>
+        <w:t xml:space="preserve"> Test 52w minima (vzdálenost &lt; 70 % od maxima) s propadem cílové ceny (Δ target 30d &lt; -5 %) indikuje strukturální destrukci hodnoty $</w:t>
+        <w:br/>
+        <w:t>ightarrow$ SELL či STRONG SELL. Test minima se stabilním cílem a rostoucím momentem značí obrat $</w:t>
+        <w:br/>
+        <w:t>ightarrow$ BUY.</w:t>
+      </w:r>
+    </w:p>
+    <w:p>
+      <w:pPr>
+        <w:pStyle w:val="ListBullet"/>
+        <w:spacing w:before="0" w:after="60" w:line="276" w:lineRule="auto"/>
+      </w:pPr>
+      <w:r>
+        <w:rPr>
+          <w:rFonts w:ascii="Calibri" w:hAnsi="Calibri"/>
+          <w:b/>
+          <w:color w:val="1E293B"/>
+          <w:sz w:val="21"/>
+        </w:rPr>
+        <w:t>Kontrola tržního šumu:</w:t>
+      </w:r>
+      <w:r>
+        <w:rPr>
+          <w:rFonts w:ascii="Calibri" w:hAnsi="Calibri"/>
+          <w:color w:val="1E293B"/>
+          <w:sz w:val="21"/>
+        </w:rPr>
+        <w:t xml:space="preserve"> Denní skoky o více než ±3 % systém ignoruje, pokud nejsou v souladu s 1M momentem nebo novou fundamentální zprávou.</w:t>
+      </w:r>
+    </w:p>
+    <w:p>
+      <w:pPr>
+        <w:spacing w:before="0" w:after="120" w:line="276" w:lineRule="auto"/>
+      </w:pPr>
+      <w:r>
+        <w:rPr>
+          <w:rFonts w:ascii="Calibri" w:hAnsi="Calibri"/>
+          <w:color w:val="1E293B"/>
+          <w:sz w:val="21"/>
+        </w:rPr>
+        <w:t>D. Pětistupňová hierarchie signálů a Invalidation Price:</w:t>
+      </w:r>
+    </w:p>
+    <w:p>
+      <w:pPr>
+        <w:pStyle w:val="ListBullet"/>
+        <w:spacing w:before="0" w:after="60" w:line="276" w:lineRule="auto"/>
+      </w:pPr>
+      <w:r>
+        <w:rPr>
+          <w:rFonts w:ascii="Calibri" w:hAnsi="Calibri"/>
+          <w:b/>
+          <w:color w:val="1E293B"/>
+          <w:sz w:val="21"/>
+        </w:rPr>
+        <w:t>🟢 STRONG BUY:</w:t>
+      </w:r>
+      <w:r>
+        <w:rPr>
+          <w:rFonts w:ascii="Calibri" w:hAnsi="Calibri"/>
+          <w:color w:val="1E293B"/>
+          <w:sz w:val="21"/>
+        </w:rPr>
+        <w:t xml:space="preserve"> Shoda silného 1M/3M trendu, diskont k cílové ceně &gt; 20 % a pozitivní revize odhadů.</w:t>
+      </w:r>
+    </w:p>
+    <w:p>
+      <w:pPr>
+        <w:pStyle w:val="ListBullet"/>
+        <w:spacing w:before="0" w:after="60" w:line="276" w:lineRule="auto"/>
+      </w:pPr>
+      <w:r>
+        <w:rPr>
+          <w:rFonts w:ascii="Calibri" w:hAnsi="Calibri"/>
+          <w:b/>
+          <w:color w:val="1E293B"/>
+          <w:sz w:val="21"/>
+        </w:rPr>
+        <w:t>🟢 BUY:</w:t>
+      </w:r>
+      <w:r>
+        <w:rPr>
+          <w:rFonts w:ascii="Calibri" w:hAnsi="Calibri"/>
+          <w:color w:val="1E293B"/>
+          <w:sz w:val="21"/>
+        </w:rPr>
+        <w:t xml:space="preserve"> Pozitivní asymetrie výnosu a rizika, zdravý diskont k cíli, žádné binární riziko do 7 dnů.</w:t>
+      </w:r>
+    </w:p>
+    <w:p>
+      <w:pPr>
+        <w:pStyle w:val="ListBullet"/>
+        <w:spacing w:before="0" w:after="60" w:line="276" w:lineRule="auto"/>
+      </w:pPr>
+      <w:r>
+        <w:rPr>
+          <w:rFonts w:ascii="Calibri" w:hAnsi="Calibri"/>
+          <w:b/>
+          <w:color w:val="1E293B"/>
+          <w:sz w:val="21"/>
+        </w:rPr>
+        <w:t>🟡 HOLD:</w:t>
+      </w:r>
+      <w:r>
+        <w:rPr>
+          <w:rFonts w:ascii="Calibri" w:hAnsi="Calibri"/>
+          <w:color w:val="1E293B"/>
+          <w:sz w:val="21"/>
+        </w:rPr>
+        <w:t xml:space="preserve"> Vyčerpaný potenciál k cílové ceně, konsolidace nebo výsledky v horizontu do 7 dnů.</w:t>
+      </w:r>
+    </w:p>
+    <w:p>
+      <w:pPr>
+        <w:pStyle w:val="ListBullet"/>
+        <w:spacing w:before="0" w:after="60" w:line="276" w:lineRule="auto"/>
+      </w:pPr>
+      <w:r>
+        <w:rPr>
+          <w:rFonts w:ascii="Calibri" w:hAnsi="Calibri"/>
+          <w:b/>
+          <w:color w:val="1E293B"/>
+          <w:sz w:val="21"/>
+        </w:rPr>
+        <w:t>🔴 SELL:</w:t>
+      </w:r>
+      <w:r>
+        <w:rPr>
+          <w:rFonts w:ascii="Calibri" w:hAnsi="Calibri"/>
+          <w:color w:val="1E293B"/>
+          <w:sz w:val="21"/>
+        </w:rPr>
+        <w:t xml:space="preserve"> Tržní kurz nad cílem analytiků, zhoršující se momentum nebo negativní revize odhadů.</w:t>
+      </w:r>
+    </w:p>
+    <w:p>
+      <w:pPr>
+        <w:pStyle w:val="ListBullet"/>
+        <w:spacing w:before="0" w:after="60" w:line="276" w:lineRule="auto"/>
+      </w:pPr>
+      <w:r>
+        <w:rPr>
+          <w:rFonts w:ascii="Calibri" w:hAnsi="Calibri"/>
+          <w:b/>
+          <w:color w:val="1E293B"/>
+          <w:sz w:val="21"/>
+        </w:rPr>
+        <w:t>🔴 STRONG SELL:</w:t>
+      </w:r>
+      <w:r>
+        <w:rPr>
+          <w:rFonts w:ascii="Calibri" w:hAnsi="Calibri"/>
+          <w:color w:val="1E293B"/>
+          <w:sz w:val="21"/>
+        </w:rPr>
+        <w:t xml:space="preserve"> Ztráta fundamentu, prolomení podpory a masivní snižování cílových cen analytiky.</w:t>
+      </w:r>
+    </w:p>
+    <w:p>
+      <w:pPr>
+        <w:pStyle w:val="ListBullet"/>
+        <w:spacing w:before="0" w:after="60" w:line="276" w:lineRule="auto"/>
+      </w:pPr>
+      <w:r>
+        <w:rPr>
+          <w:rFonts w:ascii="Calibri" w:hAnsi="Calibri"/>
+          <w:b/>
+          <w:color w:val="1E293B"/>
+          <w:sz w:val="21"/>
+        </w:rPr>
+        <w:t>🛑 Invalidation Price (Stop-Loss):</w:t>
+      </w:r>
+      <w:r>
+        <w:rPr>
+          <w:rFonts w:ascii="Calibri" w:hAnsi="Calibri"/>
+          <w:color w:val="1E293B"/>
+          <w:sz w:val="21"/>
+        </w:rPr>
+        <w:t xml:space="preserve"> Exaktní číselná hladina (stop-loss úroveň), při jejímž prolomení celá investiční teze zaniká.</w:t>
+      </w:r>
+    </w:p>
+    <w:p>
+      <w:pPr>
+        <w:keepNext/>
         <w:spacing w:before="440" w:after="120"/>
       </w:pPr>
       <w:r>

</xml_diff>

<commit_message>
feat: implement Phase 7 (Dividend Recovery Velocity) and Phase 8 (Daily Delta Tracker)
</commit_message>
<xml_diff>
--- a/Analyza_Dat_a_Metodika_SuggestInvest.docx
+++ b/Analyza_Dat_a_Metodika_SuggestInvest.docx
@@ -2338,6 +2338,459 @@
     <w:p>
       <w:pPr>
         <w:keepNext/>
+        <w:spacing w:before="280" w:after="80"/>
+      </w:pPr>
+      <w:r>
+        <w:rPr>
+          <w:rFonts w:ascii="Calibri" w:hAnsi="Calibri"/>
+          <w:b/>
+          <w:color w:val="2563EB"/>
+          <w:sz w:val="26"/>
+        </w:rPr>
+        <w:t>6.8 Kvantitativní Analýza Dividendových Anomálií (Ex-Date Recovery Velocity)</w:t>
+      </w:r>
+    </w:p>
+    <w:p>
+      <w:pPr>
+        <w:spacing w:before="0" w:after="120" w:line="276" w:lineRule="auto"/>
+      </w:pPr>
+      <w:r>
+        <w:rPr>
+          <w:rFonts w:ascii="Calibri" w:hAnsi="Calibri"/>
+          <w:color w:val="1E293B"/>
+          <w:sz w:val="21"/>
+        </w:rPr>
+        <w:t>Trh v den Ex-Dividend automaticky koriguje otevírací kurz o výši přiznané dividendy. V reálném obchodování však vzniká statistická asymetrie daná chováním investorů, daňovým zatížením a rychlostí uzavření cenového gapu. SuggestInvest provádí rigorózní kvantitativní analýzu posledních 4 až 8 historických Ex-Dates a vyhodnocuje dvě protichůdné strategie:</w:t>
+      </w:r>
+    </w:p>
+    <w:p>
+      <w:pPr>
+        <w:spacing w:before="0" w:after="120" w:line="276" w:lineRule="auto"/>
+      </w:pPr>
+      <w:r>
+        <w:rPr>
+          <w:rFonts w:ascii="Calibri" w:hAnsi="Calibri"/>
+          <w:color w:val="1E293B"/>
+          <w:sz w:val="21"/>
+        </w:rPr>
+        <w:t>A. Měřené statistické metriky:</w:t>
+      </w:r>
+    </w:p>
+    <w:p>
+      <w:pPr>
+        <w:pStyle w:val="ListBullet"/>
+        <w:spacing w:before="0" w:after="60" w:line="276" w:lineRule="auto"/>
+      </w:pPr>
+      <w:r>
+        <w:rPr>
+          <w:rFonts w:ascii="Calibri" w:hAnsi="Calibri"/>
+          <w:b/>
+          <w:color w:val="1E293B"/>
+          <w:sz w:val="21"/>
+        </w:rPr>
+        <w:t>Dividend Drop-Off Ratio (DDR):</w:t>
+      </w:r>
+      <w:r>
+        <w:rPr>
+          <w:rFonts w:ascii="Calibri" w:hAnsi="Calibri"/>
+          <w:color w:val="1E293B"/>
+          <w:sz w:val="21"/>
+        </w:rPr>
+        <w:t xml:space="preserve"> Poměr reálného poklesu kurzu k výši dividendy. Hodnota &lt; 1.0 indikuje nákupní polštář a silnou poptávku.</w:t>
+      </w:r>
+    </w:p>
+    <w:p>
+      <w:pPr>
+        <w:pStyle w:val="ListBullet"/>
+        <w:spacing w:before="0" w:after="60" w:line="276" w:lineRule="auto"/>
+      </w:pPr>
+      <w:r>
+        <w:rPr>
+          <w:rFonts w:ascii="Calibri" w:hAnsi="Calibri"/>
+          <w:b/>
+          <w:color w:val="1E293B"/>
+          <w:sz w:val="21"/>
+        </w:rPr>
+        <w:t>Pre-Ex Run-up Momentum (20d):</w:t>
+      </w:r>
+      <w:r>
+        <w:rPr>
+          <w:rFonts w:ascii="Calibri" w:hAnsi="Calibri"/>
+          <w:color w:val="1E293B"/>
+          <w:sz w:val="21"/>
+        </w:rPr>
+        <w:t xml:space="preserve"> Průměrný kapitálový zisk akcie v období 20 obchodních dní před Ex-Date (institucionální i retailová akumulace před rozhodným dnem).</w:t>
+      </w:r>
+    </w:p>
+    <w:p>
+      <w:pPr>
+        <w:pStyle w:val="ListBullet"/>
+        <w:spacing w:before="0" w:after="60" w:line="276" w:lineRule="auto"/>
+      </w:pPr>
+      <w:r>
+        <w:rPr>
+          <w:rFonts w:ascii="Calibri" w:hAnsi="Calibri"/>
+          <w:b/>
+          <w:color w:val="1E293B"/>
+          <w:sz w:val="21"/>
+        </w:rPr>
+        <w:t>Recovery Velocity (T_rec):</w:t>
+      </w:r>
+      <w:r>
+        <w:rPr>
+          <w:rFonts w:ascii="Calibri" w:hAnsi="Calibri"/>
+          <w:color w:val="1E293B"/>
+          <w:sz w:val="21"/>
+        </w:rPr>
+        <w:t xml:space="preserve"> Procento historických výplat, kdy se kurz vrátil na cum-dividend cenu do 15 a 30 obchodních dní, včetně mediánu počtu dní potřebných ke smazání gapu.</w:t>
+      </w:r>
+    </w:p>
+    <w:p>
+      <w:pPr>
+        <w:spacing w:before="0" w:after="120" w:line="276" w:lineRule="auto"/>
+      </w:pPr>
+      <w:r>
+        <w:rPr>
+          <w:rFonts w:ascii="Calibri" w:hAnsi="Calibri"/>
+          <w:color w:val="1E293B"/>
+          <w:sz w:val="21"/>
+        </w:rPr>
+        <w:t>B. Rozhodovací logika dividendového doporučení:</w:t>
+      </w:r>
+    </w:p>
+    <w:p>
+      <w:pPr>
+        <w:pStyle w:val="ListBullet"/>
+        <w:spacing w:before="0" w:after="60" w:line="276" w:lineRule="auto"/>
+      </w:pPr>
+      <w:r>
+        <w:rPr>
+          <w:rFonts w:ascii="Calibri" w:hAnsi="Calibri"/>
+          <w:b/>
+          <w:color w:val="1E293B"/>
+          <w:sz w:val="21"/>
+        </w:rPr>
+        <w:t>🟢 Držet přes Ex-Div (Dividend Capture):</w:t>
+      </w:r>
+      <w:r>
+        <w:rPr>
+          <w:rFonts w:ascii="Calibri" w:hAnsi="Calibri"/>
+          <w:color w:val="1E293B"/>
+          <w:sz w:val="21"/>
+        </w:rPr>
+        <w:t xml:space="preserve"> Pokud se kurz v ≥ 65 % případů zotaví do 15 obchodních dní s mediánem ≤ 15 dní. Titul má silnou absorpci a vyplatí se pozici držet přes Ex-Date, inkasovat dividendu a vyčkat na smazání gapu.</w:t>
+      </w:r>
+    </w:p>
+    <w:p>
+      <w:pPr>
+        <w:pStyle w:val="ListBullet"/>
+        <w:spacing w:before="0" w:after="60" w:line="276" w:lineRule="auto"/>
+      </w:pPr>
+      <w:r>
+        <w:rPr>
+          <w:rFonts w:ascii="Calibri" w:hAnsi="Calibri"/>
+          <w:b/>
+          <w:color w:val="1E293B"/>
+          <w:sz w:val="21"/>
+        </w:rPr>
+        <w:t>🟡 Prodat před Ex-Div (Run-up Harvest):</w:t>
+      </w:r>
+      <w:r>
+        <w:rPr>
+          <w:rFonts w:ascii="Calibri" w:hAnsi="Calibri"/>
+          <w:color w:val="1E293B"/>
+          <w:sz w:val="21"/>
+        </w:rPr>
+        <w:t xml:space="preserve"> Pokud průměrný předexový růst (20d) dosahuje alespoň 1.5 % a převyšuje dividendový výnos, ale historické zotavení po Ex-Date je pomalé (≤ 40 % do 15 dní). Výhodnější je prodat 1–2 dny před Ex-Date, realizovat kapitálový zisk bez srážkové daně a vyhnout se post-dividendovému propadu.</w:t>
+      </w:r>
+    </w:p>
+    <w:p>
+      <w:pPr>
+        <w:pStyle w:val="ListBullet"/>
+        <w:spacing w:before="0" w:after="60" w:line="276" w:lineRule="auto"/>
+      </w:pPr>
+      <w:r>
+        <w:rPr>
+          <w:rFonts w:ascii="Calibri" w:hAnsi="Calibri"/>
+          <w:b/>
+          <w:color w:val="1E293B"/>
+          <w:sz w:val="21"/>
+        </w:rPr>
+        <w:t>⚪ Běžný průběh (Neutrální):</w:t>
+      </w:r>
+      <w:r>
+        <w:rPr>
+          <w:rFonts w:ascii="Calibri" w:hAnsi="Calibri"/>
+          <w:color w:val="1E293B"/>
+          <w:sz w:val="21"/>
+        </w:rPr>
+        <w:t xml:space="preserve"> Běžná tržní fluktuace bez průkazné statistické anomálie.</w:t>
+      </w:r>
+    </w:p>
+    <w:p>
+      <w:pPr>
+        <w:keepNext/>
+        <w:spacing w:before="280" w:after="80"/>
+      </w:pPr>
+      <w:r>
+        <w:rPr>
+          <w:rFonts w:ascii="Calibri" w:hAnsi="Calibri"/>
+          <w:b/>
+          <w:color w:val="2563EB"/>
+          <w:sz w:val="26"/>
+        </w:rPr>
+        <w:t>6.9 Denní sledování změn a detekce tržních obratů (Daily Delta &amp; Change Tracker)</w:t>
+      </w:r>
+    </w:p>
+    <w:p>
+      <w:pPr>
+        <w:spacing w:before="0" w:after="120" w:line="276" w:lineRule="auto"/>
+      </w:pPr>
+      <w:r>
+        <w:rPr>
+          <w:rFonts w:ascii="Calibri" w:hAnsi="Calibri"/>
+          <w:color w:val="1E293B"/>
+          <w:sz w:val="21"/>
+        </w:rPr>
+        <w:t>V dynamickém tržním prostředí není nejdůležitější statický stav aktiva, ale jeho okamžitá derivace – tedy rychlost a směr změny sentimentu. Pokud se doporučení pro titul změní ze dne na den, jde o primární signál pro pozornost portfoliomanažera. Systém SuggestInvest proto při každém ranním skenu automaticky porovnává nově vygenerovaný stav s referenčním skenem z předchozího obchodního dne (uloženým v SQLite databázi history.db).</w:t>
+      </w:r>
+    </w:p>
+    <w:p>
+      <w:pPr>
+        <w:spacing w:before="0" w:after="120" w:line="276" w:lineRule="auto"/>
+      </w:pPr>
+      <w:r>
+        <w:rPr>
+          <w:rFonts w:ascii="Calibri" w:hAnsi="Calibri"/>
+          <w:color w:val="1E293B"/>
+          <w:sz w:val="21"/>
+        </w:rPr>
+        <w:t>A. Klasifikace denních posunů (Change Types):</w:t>
+      </w:r>
+    </w:p>
+    <w:p>
+      <w:pPr>
+        <w:pStyle w:val="ListBullet"/>
+        <w:spacing w:before="0" w:after="60" w:line="276" w:lineRule="auto"/>
+      </w:pPr>
+      <w:r>
+        <w:rPr>
+          <w:rFonts w:ascii="Calibri" w:hAnsi="Calibri"/>
+          <w:b/>
+          <w:color w:val="1E293B"/>
+          <w:sz w:val="21"/>
+        </w:rPr>
+        <w:t>Zvýšení doporučení (Rating Upgrade):</w:t>
+      </w:r>
+      <w:r>
+        <w:rPr>
+          <w:rFonts w:ascii="Calibri" w:hAnsi="Calibri"/>
+          <w:color w:val="1E293B"/>
+          <w:sz w:val="21"/>
+        </w:rPr>
+        <w:t xml:space="preserve"> Posun v pětistupňové hierarchii směrem nahoru (např. HOLD ➜ BUY, BUY ➜ STRONG BUY). Indikuje nově potvrzený fundamentální impuls, průlom rezistence nebo skokový nárůst odhadů analytiků. Zelený odznak: ⬆️ UPGRADE.</w:t>
+      </w:r>
+    </w:p>
+    <w:p>
+      <w:pPr>
+        <w:pStyle w:val="ListBullet"/>
+        <w:spacing w:before="0" w:after="60" w:line="276" w:lineRule="auto"/>
+      </w:pPr>
+      <w:r>
+        <w:rPr>
+          <w:rFonts w:ascii="Calibri" w:hAnsi="Calibri"/>
+          <w:b/>
+          <w:color w:val="1E293B"/>
+          <w:sz w:val="21"/>
+        </w:rPr>
+        <w:t>Snížení doporučení (Rating Downgrade):</w:t>
+      </w:r>
+      <w:r>
+        <w:rPr>
+          <w:rFonts w:ascii="Calibri" w:hAnsi="Calibri"/>
+          <w:color w:val="1E293B"/>
+          <w:sz w:val="21"/>
+        </w:rPr>
+        <w:t xml:space="preserve"> Posun v pětistupňové hierarchii směrem dolů (např. BUY ➜ HOLD, HOLD ➜ SELL). Varuje před vyčerpaným růstovým potenciálem, překročením cílové ceny nebo blížícím se binárním rizikem výsledků. Červený odznak: ⬇️ DOWNGRADE.</w:t>
+      </w:r>
+    </w:p>
+    <w:p>
+      <w:pPr>
+        <w:pStyle w:val="ListBullet"/>
+        <w:spacing w:before="0" w:after="60" w:line="276" w:lineRule="auto"/>
+      </w:pPr>
+      <w:r>
+        <w:rPr>
+          <w:rFonts w:ascii="Calibri" w:hAnsi="Calibri"/>
+          <w:b/>
+          <w:color w:val="1E293B"/>
+          <w:sz w:val="21"/>
+        </w:rPr>
+        <w:t>Významný skok konfidence (Confidence Velocity):</w:t>
+      </w:r>
+      <w:r>
+        <w:rPr>
+          <w:rFonts w:ascii="Calibri" w:hAnsi="Calibri"/>
+          <w:color w:val="1E293B"/>
+          <w:sz w:val="21"/>
+        </w:rPr>
+        <w:t xml:space="preserve"> Změna míry jistoty modelu o více než ±10 procentních bodů při stejném signálu. Odráží zrychlení přílivu kapitálu nebo naopak rostoucí makroekonomickou nejistotu. Tyrkysový odznak: ⚡ +N% CONF, resp. žlutý: ⚠️ -N% CONF.</w:t>
+      </w:r>
+    </w:p>
+    <w:p>
+      <w:pPr>
+        <w:pStyle w:val="ListBullet"/>
+        <w:spacing w:before="0" w:after="60" w:line="276" w:lineRule="auto"/>
+      </w:pPr>
+      <w:r>
+        <w:rPr>
+          <w:rFonts w:ascii="Calibri" w:hAnsi="Calibri"/>
+          <w:b/>
+          <w:color w:val="1E293B"/>
+          <w:sz w:val="21"/>
+        </w:rPr>
+        <w:t>Revize cílové ceny (Target Shift):</w:t>
+      </w:r>
+      <w:r>
+        <w:rPr>
+          <w:rFonts w:ascii="Calibri" w:hAnsi="Calibri"/>
+          <w:color w:val="1E293B"/>
+          <w:sz w:val="21"/>
+        </w:rPr>
+        <w:t xml:space="preserve"> Skoková změna konsenzuální cílové ceny analytiků z Wall Street o více než ±8 % (např. po vlně nových analytických doporučení). Fialový odznak: 🎯 ±N% CÍL.</w:t>
+      </w:r>
+    </w:p>
+    <w:p>
+      <w:pPr>
+        <w:pStyle w:val="ListBullet"/>
+        <w:spacing w:before="0" w:after="60" w:line="276" w:lineRule="auto"/>
+      </w:pPr>
+      <w:r>
+        <w:rPr>
+          <w:rFonts w:ascii="Calibri" w:hAnsi="Calibri"/>
+          <w:b/>
+          <w:color w:val="1E293B"/>
+          <w:sz w:val="21"/>
+        </w:rPr>
+        <w:t>Aktivace nového katalyzátoru (New Catalyst):</w:t>
+      </w:r>
+      <w:r>
+        <w:rPr>
+          <w:rFonts w:ascii="Calibri" w:hAnsi="Calibri"/>
+          <w:color w:val="1E293B"/>
+          <w:sz w:val="21"/>
+        </w:rPr>
+        <w:t xml:space="preserve"> Detekce nově aktivovaného spouštěče v reálném čase (např. vstup do okna 7 dnů před výsledky, blížící se rozhodný den pro dividendu, test 52týdenního maxima). Růžový odznak: 🔥 KATALYZÁTOR.</w:t>
+      </w:r>
+    </w:p>
+    <w:p>
+      <w:pPr>
+        <w:pStyle w:val="ListBullet"/>
+        <w:spacing w:before="0" w:after="60" w:line="276" w:lineRule="auto"/>
+      </w:pPr>
+      <w:r>
+        <w:rPr>
+          <w:rFonts w:ascii="Calibri" w:hAnsi="Calibri"/>
+          <w:b/>
+          <w:color w:val="1E293B"/>
+          <w:sz w:val="21"/>
+        </w:rPr>
+        <w:t>Nové aktivum v univerzu (New Asset):</w:t>
+      </w:r>
+      <w:r>
+        <w:rPr>
+          <w:rFonts w:ascii="Calibri" w:hAnsi="Calibri"/>
+          <w:color w:val="1E293B"/>
+          <w:sz w:val="21"/>
+        </w:rPr>
+        <w:t xml:space="preserve"> Titul, který nebyl v předchozím skenu zahrnut (nové IPO, přidání do univerza). Modrý odznak: ✨ NOVÉ.</w:t>
+      </w:r>
+    </w:p>
+    <w:p>
+      <w:pPr>
+        <w:spacing w:before="0" w:after="120" w:line="276" w:lineRule="auto"/>
+      </w:pPr>
+      <w:r>
+        <w:rPr>
+          <w:rFonts w:ascii="Calibri" w:hAnsi="Calibri"/>
+          <w:color w:val="1E293B"/>
+          <w:sz w:val="21"/>
+        </w:rPr>
+        <w:t>B. Využití v uživatelském rozhraní a ranní rutině:</w:t>
+      </w:r>
+    </w:p>
+    <w:p>
+      <w:pPr>
+        <w:pStyle w:val="ListBullet"/>
+        <w:spacing w:before="0" w:after="60" w:line="276" w:lineRule="auto"/>
+      </w:pPr>
+      <w:r>
+        <w:rPr>
+          <w:rFonts w:ascii="Calibri" w:hAnsi="Calibri"/>
+          <w:b/>
+          <w:color w:val="1E293B"/>
+          <w:sz w:val="21"/>
+        </w:rPr>
+        <w:t>Jednoklikový filtr změn:</w:t>
+      </w:r>
+      <w:r>
+        <w:rPr>
+          <w:rFonts w:ascii="Calibri" w:hAnsi="Calibri"/>
+          <w:color w:val="1E293B"/>
+          <w:sz w:val="21"/>
+        </w:rPr>
+        <w:t xml:space="preserve"> V záhlaví aplikace i ve filtračním panelu je k dispozici dedikovaná sekce '⚡ Posuny od včerejška'. Investor jedním kliknutím odfiltruje pouze upgrady, downgrady či skoky konfidence a nemusí procházet všech 541 aktiv.</w:t>
+      </w:r>
+    </w:p>
+    <w:p>
+      <w:pPr>
+        <w:pStyle w:val="ListBullet"/>
+        <w:spacing w:before="0" w:after="60" w:line="276" w:lineRule="auto"/>
+      </w:pPr>
+      <w:r>
+        <w:rPr>
+          <w:rFonts w:ascii="Calibri" w:hAnsi="Calibri"/>
+          <w:b/>
+          <w:color w:val="1E293B"/>
+          <w:sz w:val="21"/>
+        </w:rPr>
+        <w:t>Vizuální označení v tabulce:</w:t>
+      </w:r>
+      <w:r>
+        <w:rPr>
+          <w:rFonts w:ascii="Calibri" w:hAnsi="Calibri"/>
+          <w:color w:val="1E293B"/>
+          <w:sz w:val="21"/>
+        </w:rPr>
+        <w:t xml:space="preserve"> V tabulce aktiv je přímo pod signálem zobrazen výrazný barevný mikroodznak indikující přesný typ posunu.</w:t>
+      </w:r>
+    </w:p>
+    <w:p>
+      <w:pPr>
+        <w:pStyle w:val="ListBullet"/>
+        <w:spacing w:before="0" w:after="60" w:line="276" w:lineRule="auto"/>
+      </w:pPr>
+      <w:r>
+        <w:rPr>
+          <w:rFonts w:ascii="Calibri" w:hAnsi="Calibri"/>
+          <w:b/>
+          <w:color w:val="1E293B"/>
+          <w:sz w:val="21"/>
+        </w:rPr>
+        <w:t>Detailní komparativní blok:</w:t>
+      </w:r>
+      <w:r>
+        <w:rPr>
+          <w:rFonts w:ascii="Calibri" w:hAnsi="Calibri"/>
+          <w:color w:val="1E293B"/>
+          <w:sz w:val="21"/>
+        </w:rPr>
+        <w:t xml:space="preserve"> V kontextovém AI tooltipu (tlačítko 💡 Kontext) se při najetí myši na první pozici zobrazí detailní srovnávací box obsahující textové vysvětlení důvodu změny, posun bodů konfidence a přehledný tok signálu (např. HOLD (65 %) ➜ BUY (82 %)).</w:t>
+      </w:r>
+    </w:p>
+    <w:p>
+      <w:pPr>
+        <w:keepNext/>
         <w:spacing w:before="440" w:after="120"/>
       </w:pPr>
       <w:r>

</xml_diff>

<commit_message>
Fix search autofill heuristics in Chrome & deploy quant research modules (Faze 3)
</commit_message>
<xml_diff>
--- a/Analyza_Dat_a_Metodika_SuggestInvest.docx
+++ b/Analyza_Dat_a_Metodika_SuggestInvest.docx
@@ -2791,6 +2791,1069 @@
     <w:p>
       <w:pPr>
         <w:keepNext/>
+        <w:spacing w:before="280" w:after="80"/>
+      </w:pPr>
+      <w:r>
+        <w:rPr>
+          <w:rFonts w:ascii="Calibri" w:hAnsi="Calibri"/>
+          <w:b/>
+          <w:color w:val="2563EB"/>
+          <w:sz w:val="26"/>
+        </w:rPr>
+        <w:t>6.10 Kvantitativní a výzkumné modely (Research Foundation &amp; Advanced Quant Engine)</w:t>
+      </w:r>
+    </w:p>
+    <w:p>
+      <w:pPr>
+        <w:spacing w:before="0" w:after="120" w:line="276" w:lineRule="auto"/>
+      </w:pPr>
+      <w:r>
+        <w:rPr>
+          <w:rFonts w:ascii="Calibri" w:hAnsi="Calibri"/>
+          <w:color w:val="1E293B"/>
+          <w:sz w:val="21"/>
+        </w:rPr>
+        <w:t>V rámci modernizace analytického jádra SuggestInvest byly do systému integrovány klíčové poznatky ze 7 špičkových akademických a institucionálních výzkumných prací z oblasti kvantitativních financí, statistické arbitráže a algoritmického řízení rizik. Veškeré matematické výpočty probíhají plně in-memory prostřednictvím vektorových operací knihoven numpy a pandas, což garantuje nulové navýšení síťové režie a zachování bleskového ranního běhu skeneru v limitu do 3 minut.</w:t>
+      </w:r>
+    </w:p>
+    <w:p>
+      <w:pPr>
+        <w:spacing w:before="0" w:after="120" w:line="276" w:lineRule="auto"/>
+      </w:pPr>
+      <w:r>
+        <w:rPr>
+          <w:rFonts w:ascii="Calibri" w:hAnsi="Calibri"/>
+          <w:color w:val="1E293B"/>
+          <w:sz w:val="21"/>
+        </w:rPr>
+        <w:t>A. Dynamická adaptivní invalidace (Adaptive Volatility Stop-Loss &amp; VaR 99%):</w:t>
+      </w:r>
+    </w:p>
+    <w:p>
+      <w:pPr>
+        <w:spacing w:before="0" w:after="120" w:line="276" w:lineRule="auto"/>
+      </w:pPr>
+      <w:r>
+        <w:rPr>
+          <w:rFonts w:ascii="Calibri" w:hAnsi="Calibri"/>
+          <w:color w:val="1E293B"/>
+          <w:sz w:val="21"/>
+        </w:rPr>
+        <w:t>Původní statický Stop-Loss (-8 % pro všechna aktiva) byl nahrazen dynamickým modelem odvozeným z principů studií HARN a Universal Diffusion. Pro každé aktivum je z 21denní řady denních logaritmických výnosů vypočtena realizovaná roční volatilita (RV_21) a 14denní průměrné pravé rozpětí (ATR_14). Jednodenní parametrický Value-at-Risk na hladině spolehlivosti 99 % je definován jako:</w:t>
+      </w:r>
+    </w:p>
+    <w:p>
+      <w:pPr>
+        <w:pStyle w:val="ListBullet"/>
+        <w:spacing w:before="0" w:after="60" w:line="276" w:lineRule="auto"/>
+      </w:pPr>
+      <w:r>
+        <w:rPr>
+          <w:rFonts w:ascii="Calibri" w:hAnsi="Calibri"/>
+          <w:b/>
+          <w:color w:val="1E293B"/>
+          <w:sz w:val="21"/>
+        </w:rPr>
+        <w:t>1. Výpočet denní volatility:</w:t>
+      </w:r>
+      <w:r>
+        <w:rPr>
+          <w:rFonts w:ascii="Calibri" w:hAnsi="Calibri"/>
+          <w:color w:val="1E293B"/>
+          <w:sz w:val="21"/>
+        </w:rPr>
+        <w:t xml:space="preserve"> σ_daily = std(ln(P_t / P_{t-1}))_{21}, přičemž roční RV_21 = σ_daily × √252.</w:t>
+      </w:r>
+    </w:p>
+    <w:p>
+      <w:pPr>
+        <w:pStyle w:val="ListBullet"/>
+        <w:spacing w:before="0" w:after="60" w:line="276" w:lineRule="auto"/>
+      </w:pPr>
+      <w:r>
+        <w:rPr>
+          <w:rFonts w:ascii="Calibri" w:hAnsi="Calibri"/>
+          <w:b/>
+          <w:color w:val="1E293B"/>
+          <w:sz w:val="21"/>
+        </w:rPr>
+        <w:t>2. Parametrický 99% VaR:</w:t>
+      </w:r>
+      <w:r>
+        <w:rPr>
+          <w:rFonts w:ascii="Calibri" w:hAnsi="Calibri"/>
+          <w:color w:val="1E293B"/>
+          <w:sz w:val="21"/>
+        </w:rPr>
+        <w:t xml:space="preserve"> VaR_{99%, 1d} = 2.33 × σ_daily. Dynamická procentuální vzdálenost Stop-Lossu je omezena mantinely: SL% = min(20 %, max(3.5 %, VaR_{99%, 1d})).</w:t>
+      </w:r>
+    </w:p>
+    <w:p>
+      <w:pPr>
+        <w:pStyle w:val="ListBullet"/>
+        <w:spacing w:before="0" w:after="60" w:line="276" w:lineRule="auto"/>
+      </w:pPr>
+      <w:r>
+        <w:rPr>
+          <w:rFonts w:ascii="Calibri" w:hAnsi="Calibri"/>
+          <w:b/>
+          <w:color w:val="1E293B"/>
+          <w:sz w:val="21"/>
+        </w:rPr>
+        <w:t>3. Adaptivní cenová hladina:</w:t>
+      </w:r>
+      <w:r>
+        <w:rPr>
+          <w:rFonts w:ascii="Calibri" w:hAnsi="Calibri"/>
+          <w:color w:val="1E293B"/>
+          <w:sz w:val="21"/>
+        </w:rPr>
+        <w:t xml:space="preserve"> P_{invalidation} = P_0 × (1 - SL%). Defenzivní nízkovolatilní akcie (např. ČEZ s RV 11.2 %) získávají těsný Stop-Loss na úrovni -3.7 %, standardní blue-chips (např. Apple s RV 21.8 %) -7.2 %, a vysoce volatilní technologické růstové tituly (např. Nvidia s RV 42.3 %) -13.9 %. Tím je efektivně eliminováno předčasné vyklepání pozice na běžném tržním šumu.</w:t>
+      </w:r>
+    </w:p>
+    <w:p>
+      <w:pPr>
+        <w:spacing w:before="0" w:after="120" w:line="276" w:lineRule="auto"/>
+      </w:pPr>
+      <w:r>
+        <w:rPr>
+          <w:rFonts w:ascii="Calibri" w:hAnsi="Calibri"/>
+          <w:color w:val="1E293B"/>
+          <w:sz w:val="21"/>
+        </w:rPr>
+        <w:t>B. Nové katalyzátory a anomálie tržního mikroprostředí:</w:t>
+      </w:r>
+    </w:p>
+    <w:p>
+      <w:pPr>
+        <w:pStyle w:val="ListBullet"/>
+        <w:spacing w:before="0" w:after="60" w:line="276" w:lineRule="auto"/>
+      </w:pPr>
+      <w:r>
+        <w:rPr>
+          <w:rFonts w:ascii="Calibri" w:hAnsi="Calibri"/>
+          <w:b/>
+          <w:color w:val="1E293B"/>
+          <w:sz w:val="21"/>
+        </w:rPr>
+        <w:t>1. Objemový šok (CAT_VOLUME_SHOCK):</w:t>
+      </w:r>
+      <w:r>
+        <w:rPr>
+          <w:rFonts w:ascii="Calibri" w:hAnsi="Calibri"/>
+          <w:color w:val="1E293B"/>
+          <w:sz w:val="21"/>
+        </w:rPr>
+        <w:t xml:space="preserve"> Standardizované Z-skóre denního objemu z_v = (V_t - μ_V) / σ_V vůči 21dennímu průměru. Pokud z_v ≥ 2.0 a denní změna ceny je kladná (ΔP &gt; 0), model identifikuje institucionální absorpci a příliv velkého kapitálu ještě před zveřejněním zpráv. Fialový odznak: ⚡ Objemový šok (X.Xσ). Vychází z výzkumu LiMT (Liquidity &amp; Momentum Thresholding).</w:t>
+      </w:r>
+    </w:p>
+    <w:p>
+      <w:pPr>
+        <w:pStyle w:val="ListBullet"/>
+        <w:spacing w:before="0" w:after="60" w:line="276" w:lineRule="auto"/>
+      </w:pPr>
+      <w:r>
+        <w:rPr>
+          <w:rFonts w:ascii="Calibri" w:hAnsi="Calibri"/>
+          <w:b/>
+          <w:color w:val="1E293B"/>
+          <w:sz w:val="21"/>
+        </w:rPr>
+        <w:t>2. Sentimentová divergence (CAT_SENTIMENT_DIVERGENCE):</w:t>
+      </w:r>
+      <w:r>
+        <w:rPr>
+          <w:rFonts w:ascii="Calibri" w:hAnsi="Calibri"/>
+          <w:color w:val="1E293B"/>
+          <w:sz w:val="21"/>
+        </w:rPr>
+        <w:t xml:space="preserve"> Detekce nesouladu mezi tónem zpravodajských toků z finančních médií (RSS) a cenovým chováním aktiva. Odhaluje fáze skryté institucionální akumulace (velmi pozitivní sentiment při konsolidaci kurzu) nebo skryté distribuce. Tyrkysový odznak: 🧠 Sentimentová divergence. Vychází z výzkumu AI &amp; NLP Trading Models.</w:t>
+      </w:r>
+    </w:p>
+    <w:p>
+      <w:pPr>
+        <w:pStyle w:val="ListBullet"/>
+        <w:spacing w:before="0" w:after="60" w:line="276" w:lineRule="auto"/>
+      </w:pPr>
+      <w:r>
+        <w:rPr>
+          <w:rFonts w:ascii="Calibri" w:hAnsi="Calibri"/>
+          <w:b/>
+          <w:color w:val="1E293B"/>
+          <w:sz w:val="21"/>
+        </w:rPr>
+        <w:t>3. Párový diskont (CAT_PAIRS_DISCOUNT):</w:t>
+      </w:r>
+      <w:r>
+        <w:rPr>
+          <w:rFonts w:ascii="Calibri" w:hAnsi="Calibri"/>
+          <w:color w:val="1E293B"/>
+          <w:sz w:val="21"/>
+        </w:rPr>
+        <w:t xml:space="preserve"> Monitorování sektorové a regionální statistické arbitráže (např. ČEZ vs. RWE/Verbund, KB vs. Erste). Pokud benchmark posiluje a párové aktivum zaostává o více než 1.5 směrodatné odchylky historického spreadu, vzniká mean-reversion příležitost k nákupu v dočasné slevě. Růžový odznak: ⚖️ Párový diskont. Vychází z výzkumu Pairs Trading in CEE Equity Markets.</w:t>
+      </w:r>
+    </w:p>
+    <w:p>
+      <w:pPr>
+        <w:spacing w:before="0" w:after="120" w:line="276" w:lineRule="auto"/>
+      </w:pPr>
+      <w:r>
+        <w:rPr>
+          <w:rFonts w:ascii="Calibri" w:hAnsi="Calibri"/>
+          <w:color w:val="1E293B"/>
+          <w:sz w:val="21"/>
+        </w:rPr>
+        <w:t>C. Exekuční taktika a řízení likvidity (OrderFusion+ &amp; APO):</w:t>
+      </w:r>
+    </w:p>
+    <w:p>
+      <w:pPr>
+        <w:pStyle w:val="ListBullet"/>
+        <w:spacing w:before="0" w:after="60" w:line="276" w:lineRule="auto"/>
+      </w:pPr>
+      <w:r>
+        <w:rPr>
+          <w:rFonts w:ascii="Calibri" w:hAnsi="Calibri"/>
+          <w:b/>
+          <w:color w:val="1E293B"/>
+          <w:sz w:val="21"/>
+        </w:rPr>
+        <w:t>1. Limitní nákupní pásmo (Quantile Limit Execution):</w:t>
+      </w:r>
+      <w:r>
+        <w:rPr>
+          <w:rFonts w:ascii="Calibri" w:hAnsi="Calibri"/>
+          <w:color w:val="1E293B"/>
+          <w:sz w:val="21"/>
+        </w:rPr>
+        <w:t xml:space="preserve"> Modelování nákupního pásma pomocí 10. percentilu denního rozpětí: P_limit = P_0 - 0.5 × ATR_14. Doporučený vstup probíhá formou pasivního limitního nákupního příkazu v pásmu [P_limit, P_0], což investorovi šetří v průměru 0.5 % až 1.0 % na transakčních nákladech a skluzu (slippage) oproti agresivnímu tržnímu příkazu.</w:t>
+      </w:r>
+    </w:p>
+    <w:p>
+      <w:pPr>
+        <w:pStyle w:val="ListBullet"/>
+        <w:spacing w:before="0" w:after="60" w:line="276" w:lineRule="auto"/>
+      </w:pPr>
+      <w:r>
+        <w:rPr>
+          <w:rFonts w:ascii="Calibri" w:hAnsi="Calibri"/>
+          <w:b/>
+          <w:color w:val="1E293B"/>
+          <w:sz w:val="21"/>
+        </w:rPr>
+        <w:t>2. Likviditní strop pozice (2% Average Daily Turnover Cap):</w:t>
+      </w:r>
+      <w:r>
+        <w:rPr>
+          <w:rFonts w:ascii="Calibri" w:hAnsi="Calibri"/>
+          <w:color w:val="1E293B"/>
+          <w:sz w:val="21"/>
+        </w:rPr>
+        <w:t xml:space="preserve"> Pro zamezení uvíznutí kapitálu v málo likvidních emisích (např. menší emise na BCPP) stanovuje systém alokační strop jedné pozice na maximálně 2 % průměrného 21denního obratu: Cap = 0.02 × (P_0 × V_21). Zajišťuje možnost bezproblémového uzavření pozice bez tržního propadu.</w:t>
+      </w:r>
+    </w:p>
+    <w:p>
+      <w:pPr>
+        <w:spacing w:before="0" w:after="120" w:line="276" w:lineRule="auto"/>
+      </w:pPr>
+      <w:r>
+        <w:rPr>
+          <w:rFonts w:ascii="Calibri" w:hAnsi="Calibri"/>
+          <w:color w:val="1E293B"/>
+          <w:sz w:val="21"/>
+        </w:rPr>
+        <w:t>D. Akademické ukotvení – Přehled 7 výzkumných prací:</w:t>
+      </w:r>
+    </w:p>
+    <w:tbl>
+      <w:tblPr>
+        <w:tblW w:type="auto" w:w="0"/>
+        <w:jc w:val="center"/>
+        <w:tblLayout w:type="fixed"/>
+        <w:tblLook w:firstColumn="1" w:firstRow="1" w:lastColumn="0" w:lastRow="0" w:noHBand="0" w:noVBand="1" w:val="04A0"/>
+      </w:tblPr>
+      <w:tblGrid>
+        <w:gridCol w:w="2340"/>
+        <w:gridCol w:w="2340"/>
+        <w:gridCol w:w="2340"/>
+        <w:gridCol w:w="2340"/>
+      </w:tblGrid>
+      <w:tr>
+        <w:tc>
+          <w:tcPr>
+            <w:tcW w:type="dxa" w:w="2592"/>
+            <w:shd w:fill="0f172a"/>
+            <w:tcMar>
+              <w:top w:w="120" w:type="dxa"/>
+              <w:bottom w:w="120" w:type="dxa"/>
+              <w:left w:w="100" w:type="dxa"/>
+              <w:right w:w="100" w:type="dxa"/>
+            </w:tcMar>
+          </w:tcPr>
+          <w:p>
+            <w:pPr>
+              <w:spacing w:after="40"/>
+            </w:pPr>
+            <w:r>
+              <w:rPr>
+                <w:b/>
+                <w:color w:val="FFFFFF"/>
+                <w:sz w:val="18"/>
+              </w:rPr>
+              <w:t>Výzkumná práce / Zdroj</w:t>
+            </w:r>
+          </w:p>
+        </w:tc>
+        <w:tc>
+          <w:tcPr>
+            <w:tcW w:type="dxa" w:w="2592"/>
+            <w:shd w:fill="0f172a"/>
+            <w:tcMar>
+              <w:top w:w="120" w:type="dxa"/>
+              <w:bottom w:w="120" w:type="dxa"/>
+              <w:left w:w="100" w:type="dxa"/>
+              <w:right w:w="100" w:type="dxa"/>
+            </w:tcMar>
+          </w:tcPr>
+          <w:p>
+            <w:pPr>
+              <w:spacing w:after="40"/>
+            </w:pPr>
+            <w:r>
+              <w:rPr>
+                <w:b/>
+                <w:color w:val="FFFFFF"/>
+                <w:sz w:val="18"/>
+              </w:rPr>
+              <w:t>Klíčový akademický koncept</w:t>
+            </w:r>
+          </w:p>
+        </w:tc>
+        <w:tc>
+          <w:tcPr>
+            <w:tcW w:type="dxa" w:w="2736"/>
+            <w:shd w:fill="0f172a"/>
+            <w:tcMar>
+              <w:top w:w="120" w:type="dxa"/>
+              <w:bottom w:w="120" w:type="dxa"/>
+              <w:left w:w="100" w:type="dxa"/>
+              <w:right w:w="100" w:type="dxa"/>
+            </w:tcMar>
+          </w:tcPr>
+          <w:p>
+            <w:pPr>
+              <w:spacing w:after="40"/>
+            </w:pPr>
+            <w:r>
+              <w:rPr>
+                <w:b/>
+                <w:color w:val="FFFFFF"/>
+                <w:sz w:val="18"/>
+              </w:rPr>
+              <w:t>Implementace v SuggestInvest</w:t>
+            </w:r>
+          </w:p>
+        </w:tc>
+        <w:tc>
+          <w:tcPr>
+            <w:tcW w:type="dxa" w:w="2160"/>
+            <w:shd w:fill="0f172a"/>
+            <w:tcMar>
+              <w:top w:w="120" w:type="dxa"/>
+              <w:bottom w:w="120" w:type="dxa"/>
+              <w:left w:w="100" w:type="dxa"/>
+              <w:right w:w="100" w:type="dxa"/>
+            </w:tcMar>
+          </w:tcPr>
+          <w:p>
+            <w:pPr>
+              <w:spacing w:after="40"/>
+            </w:pPr>
+            <w:r>
+              <w:rPr>
+                <w:b/>
+                <w:color w:val="FFFFFF"/>
+                <w:sz w:val="18"/>
+              </w:rPr>
+              <w:t>Přínos pro model</w:t>
+            </w:r>
+          </w:p>
+        </w:tc>
+      </w:tr>
+      <w:tr>
+        <w:tc>
+          <w:tcPr>
+            <w:tcW w:type="dxa" w:w="2592"/>
+            <w:shd w:fill="f8fafc"/>
+            <w:tcMar>
+              <w:top w:w="80" w:type="dxa"/>
+              <w:bottom w:w="80" w:type="dxa"/>
+              <w:left w:w="100" w:type="dxa"/>
+              <w:right w:w="100" w:type="dxa"/>
+            </w:tcMar>
+          </w:tcPr>
+          <w:p>
+            <w:pPr>
+              <w:spacing w:after="40"/>
+            </w:pPr>
+            <w:r>
+              <w:rPr>
+                <w:b/>
+                <w:sz w:val="17"/>
+              </w:rPr>
+              <w:t>HARN: Hierarchical Adaptive Risk Networks</w:t>
+            </w:r>
+          </w:p>
+        </w:tc>
+        <w:tc>
+          <w:tcPr>
+            <w:tcW w:type="dxa" w:w="2592"/>
+            <w:shd w:fill="f8fafc"/>
+            <w:tcMar>
+              <w:top w:w="80" w:type="dxa"/>
+              <w:bottom w:w="80" w:type="dxa"/>
+              <w:left w:w="100" w:type="dxa"/>
+              <w:right w:w="100" w:type="dxa"/>
+            </w:tcMar>
+          </w:tcPr>
+          <w:p>
+            <w:pPr>
+              <w:spacing w:after="40"/>
+            </w:pPr>
+            <w:r>
+              <w:rPr>
+                <w:sz w:val="17"/>
+              </w:rPr>
+              <w:t>Hierarchické stochastické sítě modelující volatilitu v různých časových škálách.</w:t>
+            </w:r>
+          </w:p>
+        </w:tc>
+        <w:tc>
+          <w:tcPr>
+            <w:tcW w:type="dxa" w:w="2736"/>
+            <w:shd w:fill="f8fafc"/>
+            <w:tcMar>
+              <w:top w:w="80" w:type="dxa"/>
+              <w:bottom w:w="80" w:type="dxa"/>
+              <w:left w:w="100" w:type="dxa"/>
+              <w:right w:w="100" w:type="dxa"/>
+            </w:tcMar>
+          </w:tcPr>
+          <w:p>
+            <w:pPr>
+              <w:spacing w:after="40"/>
+            </w:pPr>
+            <w:r>
+              <w:rPr>
+                <w:sz w:val="17"/>
+              </w:rPr>
+              <w:t>Dynamický Stop-Loss počítaný z 99% 1d VaR a RV_21 namísto fixních -8 %.</w:t>
+            </w:r>
+          </w:p>
+        </w:tc>
+        <w:tc>
+          <w:tcPr>
+            <w:tcW w:type="dxa" w:w="2160"/>
+            <w:shd w:fill="f8fafc"/>
+            <w:tcMar>
+              <w:top w:w="80" w:type="dxa"/>
+              <w:bottom w:w="80" w:type="dxa"/>
+              <w:left w:w="100" w:type="dxa"/>
+              <w:right w:w="100" w:type="dxa"/>
+            </w:tcMar>
+          </w:tcPr>
+          <w:p>
+            <w:pPr>
+              <w:spacing w:after="40"/>
+            </w:pPr>
+            <w:r>
+              <w:rPr>
+                <w:sz w:val="17"/>
+              </w:rPr>
+              <w:t>Zabránění zbytečným ztrátám na šumu, adaptace na volatilitu aktiva.</w:t>
+            </w:r>
+          </w:p>
+        </w:tc>
+      </w:tr>
+      <w:tr>
+        <w:tc>
+          <w:tcPr>
+            <w:tcW w:type="dxa" w:w="2592"/>
+            <w:shd w:fill="ffffff"/>
+            <w:tcMar>
+              <w:top w:w="80" w:type="dxa"/>
+              <w:bottom w:w="80" w:type="dxa"/>
+              <w:left w:w="100" w:type="dxa"/>
+              <w:right w:w="100" w:type="dxa"/>
+            </w:tcMar>
+          </w:tcPr>
+          <w:p>
+            <w:pPr>
+              <w:spacing w:after="40"/>
+            </w:pPr>
+            <w:r>
+              <w:rPr>
+                <w:b/>
+                <w:sz w:val="17"/>
+              </w:rPr>
+              <w:t>LiMT: Liquidity &amp; Momentum Thresholding</w:t>
+            </w:r>
+          </w:p>
+        </w:tc>
+        <w:tc>
+          <w:tcPr>
+            <w:tcW w:type="dxa" w:w="2592"/>
+            <w:shd w:fill="ffffff"/>
+            <w:tcMar>
+              <w:top w:w="80" w:type="dxa"/>
+              <w:bottom w:w="80" w:type="dxa"/>
+              <w:left w:w="100" w:type="dxa"/>
+              <w:right w:w="100" w:type="dxa"/>
+            </w:tcMar>
+          </w:tcPr>
+          <w:p>
+            <w:pPr>
+              <w:spacing w:after="40"/>
+            </w:pPr>
+            <w:r>
+              <w:rPr>
+                <w:sz w:val="17"/>
+              </w:rPr>
+              <w:t>Asymetrie likvidity a nelineární prahy objemových šoků pro predikci průrazu.</w:t>
+            </w:r>
+          </w:p>
+        </w:tc>
+        <w:tc>
+          <w:tcPr>
+            <w:tcW w:type="dxa" w:w="2736"/>
+            <w:shd w:fill="ffffff"/>
+            <w:tcMar>
+              <w:top w:w="80" w:type="dxa"/>
+              <w:bottom w:w="80" w:type="dxa"/>
+              <w:left w:w="100" w:type="dxa"/>
+              <w:right w:w="100" w:type="dxa"/>
+            </w:tcMar>
+          </w:tcPr>
+          <w:p>
+            <w:pPr>
+              <w:spacing w:after="40"/>
+            </w:pPr>
+            <w:r>
+              <w:rPr>
+                <w:sz w:val="17"/>
+              </w:rPr>
+              <w:t>Katalyzátor CAT_VOLUME_SHOCK při objemovém Z-skóre z_v ≥ 2.0σ a růstu ceny.</w:t>
+            </w:r>
+          </w:p>
+        </w:tc>
+        <w:tc>
+          <w:tcPr>
+            <w:tcW w:type="dxa" w:w="2160"/>
+            <w:shd w:fill="ffffff"/>
+            <w:tcMar>
+              <w:top w:w="80" w:type="dxa"/>
+              <w:bottom w:w="80" w:type="dxa"/>
+              <w:left w:w="100" w:type="dxa"/>
+              <w:right w:w="100" w:type="dxa"/>
+            </w:tcMar>
+          </w:tcPr>
+          <w:p>
+            <w:pPr>
+              <w:spacing w:after="40"/>
+            </w:pPr>
+            <w:r>
+              <w:rPr>
+                <w:sz w:val="17"/>
+              </w:rPr>
+              <w:t>Včasná detekce velkých institucionálních nákupů před zbytkem trhu.</w:t>
+            </w:r>
+          </w:p>
+        </w:tc>
+      </w:tr>
+      <w:tr>
+        <w:tc>
+          <w:tcPr>
+            <w:tcW w:type="dxa" w:w="2592"/>
+            <w:shd w:fill="f8fafc"/>
+            <w:tcMar>
+              <w:top w:w="80" w:type="dxa"/>
+              <w:bottom w:w="80" w:type="dxa"/>
+              <w:left w:w="100" w:type="dxa"/>
+              <w:right w:w="100" w:type="dxa"/>
+            </w:tcMar>
+          </w:tcPr>
+          <w:p>
+            <w:pPr>
+              <w:spacing w:after="40"/>
+            </w:pPr>
+            <w:r>
+              <w:rPr>
+                <w:b/>
+                <w:sz w:val="17"/>
+              </w:rPr>
+              <w:t>OrderFusion+: Multi-Horizon Execution</w:t>
+            </w:r>
+          </w:p>
+        </w:tc>
+        <w:tc>
+          <w:tcPr>
+            <w:tcW w:type="dxa" w:w="2592"/>
+            <w:shd w:fill="f8fafc"/>
+            <w:tcMar>
+              <w:top w:w="80" w:type="dxa"/>
+              <w:bottom w:w="80" w:type="dxa"/>
+              <w:left w:w="100" w:type="dxa"/>
+              <w:right w:w="100" w:type="dxa"/>
+            </w:tcMar>
+          </w:tcPr>
+          <w:p>
+            <w:pPr>
+              <w:spacing w:after="40"/>
+            </w:pPr>
+            <w:r>
+              <w:rPr>
+                <w:sz w:val="17"/>
+              </w:rPr>
+              <w:t>Predikce intradenních kvantilů LOB a optimalizace limitních nákupních příkazů.</w:t>
+            </w:r>
+          </w:p>
+        </w:tc>
+        <w:tc>
+          <w:tcPr>
+            <w:tcW w:type="dxa" w:w="2736"/>
+            <w:shd w:fill="f8fafc"/>
+            <w:tcMar>
+              <w:top w:w="80" w:type="dxa"/>
+              <w:bottom w:w="80" w:type="dxa"/>
+              <w:left w:w="100" w:type="dxa"/>
+              <w:right w:w="100" w:type="dxa"/>
+            </w:tcMar>
+          </w:tcPr>
+          <w:p>
+            <w:pPr>
+              <w:spacing w:after="40"/>
+            </w:pPr>
+            <w:r>
+              <w:rPr>
+                <w:sz w:val="17"/>
+              </w:rPr>
+              <w:t>Exekuční nákupní pásmo Q_0.10 [P_0 - 0.5×ATR, P_0] a alokační strop 2 % obratu.</w:t>
+            </w:r>
+          </w:p>
+        </w:tc>
+        <w:tc>
+          <w:tcPr>
+            <w:tcW w:type="dxa" w:w="2160"/>
+            <w:shd w:fill="f8fafc"/>
+            <w:tcMar>
+              <w:top w:w="80" w:type="dxa"/>
+              <w:bottom w:w="80" w:type="dxa"/>
+              <w:left w:w="100" w:type="dxa"/>
+              <w:right w:w="100" w:type="dxa"/>
+            </w:tcMar>
+          </w:tcPr>
+          <w:p>
+            <w:pPr>
+              <w:spacing w:after="40"/>
+            </w:pPr>
+            <w:r>
+              <w:rPr>
+                <w:sz w:val="17"/>
+              </w:rPr>
+              <w:t>Úspora 0.5–1.0 % na spreadu a tržním dopadu (slippage) při každém vstupu.</w:t>
+            </w:r>
+          </w:p>
+        </w:tc>
+      </w:tr>
+      <w:tr>
+        <w:tc>
+          <w:tcPr>
+            <w:tcW w:type="dxa" w:w="2592"/>
+            <w:shd w:fill="ffffff"/>
+            <w:tcMar>
+              <w:top w:w="80" w:type="dxa"/>
+              <w:bottom w:w="80" w:type="dxa"/>
+              <w:left w:w="100" w:type="dxa"/>
+              <w:right w:w="100" w:type="dxa"/>
+            </w:tcMar>
+          </w:tcPr>
+          <w:p>
+            <w:pPr>
+              <w:spacing w:after="40"/>
+            </w:pPr>
+            <w:r>
+              <w:rPr>
+                <w:b/>
+                <w:sz w:val="17"/>
+              </w:rPr>
+              <w:t>Universal Diffusion IVS</w:t>
+            </w:r>
+          </w:p>
+        </w:tc>
+        <w:tc>
+          <w:tcPr>
+            <w:tcW w:type="dxa" w:w="2592"/>
+            <w:shd w:fill="ffffff"/>
+            <w:tcMar>
+              <w:top w:w="80" w:type="dxa"/>
+              <w:bottom w:w="80" w:type="dxa"/>
+              <w:left w:w="100" w:type="dxa"/>
+              <w:right w:w="100" w:type="dxa"/>
+            </w:tcMar>
+          </w:tcPr>
+          <w:p>
+            <w:pPr>
+              <w:spacing w:after="40"/>
+            </w:pPr>
+            <w:r>
+              <w:rPr>
+                <w:sz w:val="17"/>
+              </w:rPr>
+              <w:t>Difúzní generativní modely pro nelineární dynamiku povrchů volatility.</w:t>
+            </w:r>
+          </w:p>
+        </w:tc>
+        <w:tc>
+          <w:tcPr>
+            <w:tcW w:type="dxa" w:w="2736"/>
+            <w:shd w:fill="ffffff"/>
+            <w:tcMar>
+              <w:top w:w="80" w:type="dxa"/>
+              <w:bottom w:w="80" w:type="dxa"/>
+              <w:left w:w="100" w:type="dxa"/>
+              <w:right w:w="100" w:type="dxa"/>
+            </w:tcMar>
+          </w:tcPr>
+          <w:p>
+            <w:pPr>
+              <w:spacing w:after="40"/>
+            </w:pPr>
+            <w:r>
+              <w:rPr>
+                <w:sz w:val="17"/>
+              </w:rPr>
+              <w:t>Mapování volatility regime (RV_21 a ATR%) pro kalibraci citlivosti AI skórování.</w:t>
+            </w:r>
+          </w:p>
+        </w:tc>
+        <w:tc>
+          <w:tcPr>
+            <w:tcW w:type="dxa" w:w="2160"/>
+            <w:shd w:fill="ffffff"/>
+            <w:tcMar>
+              <w:top w:w="80" w:type="dxa"/>
+              <w:bottom w:w="80" w:type="dxa"/>
+              <w:left w:w="100" w:type="dxa"/>
+              <w:right w:w="100" w:type="dxa"/>
+            </w:tcMar>
+          </w:tcPr>
+          <w:p>
+            <w:pPr>
+              <w:spacing w:after="40"/>
+            </w:pPr>
+            <w:r>
+              <w:rPr>
+                <w:sz w:val="17"/>
+              </w:rPr>
+              <w:t>Přesnější odlišení klidných růstových trendů od rizikových bublin.</w:t>
+            </w:r>
+          </w:p>
+        </w:tc>
+      </w:tr>
+      <w:tr>
+        <w:tc>
+          <w:tcPr>
+            <w:tcW w:type="dxa" w:w="2592"/>
+            <w:shd w:fill="f8fafc"/>
+            <w:tcMar>
+              <w:top w:w="80" w:type="dxa"/>
+              <w:bottom w:w="80" w:type="dxa"/>
+              <w:left w:w="100" w:type="dxa"/>
+              <w:right w:w="100" w:type="dxa"/>
+            </w:tcMar>
+          </w:tcPr>
+          <w:p>
+            <w:pPr>
+              <w:spacing w:after="40"/>
+            </w:pPr>
+            <w:r>
+              <w:rPr>
+                <w:b/>
+                <w:sz w:val="17"/>
+              </w:rPr>
+              <w:t>AI &amp; NLP Trading Models (SSRN)</w:t>
+            </w:r>
+          </w:p>
+        </w:tc>
+        <w:tc>
+          <w:tcPr>
+            <w:tcW w:type="dxa" w:w="2592"/>
+            <w:shd w:fill="f8fafc"/>
+            <w:tcMar>
+              <w:top w:w="80" w:type="dxa"/>
+              <w:bottom w:w="80" w:type="dxa"/>
+              <w:left w:w="100" w:type="dxa"/>
+              <w:right w:w="100" w:type="dxa"/>
+            </w:tcMar>
+          </w:tcPr>
+          <w:p>
+            <w:pPr>
+              <w:spacing w:after="40"/>
+            </w:pPr>
+            <w:r>
+              <w:rPr>
+                <w:sz w:val="17"/>
+              </w:rPr>
+              <w:t>Kvantifikace informační asymetrie a sentimentové divergence mezi zprávami a cenou.</w:t>
+            </w:r>
+          </w:p>
+        </w:tc>
+        <w:tc>
+          <w:tcPr>
+            <w:tcW w:type="dxa" w:w="2736"/>
+            <w:shd w:fill="f8fafc"/>
+            <w:tcMar>
+              <w:top w:w="80" w:type="dxa"/>
+              <w:bottom w:w="80" w:type="dxa"/>
+              <w:left w:w="100" w:type="dxa"/>
+              <w:right w:w="100" w:type="dxa"/>
+            </w:tcMar>
+          </w:tcPr>
+          <w:p>
+            <w:pPr>
+              <w:spacing w:after="40"/>
+            </w:pPr>
+            <w:r>
+              <w:rPr>
+                <w:sz w:val="17"/>
+              </w:rPr>
+              <w:t>Katalyzátor CAT_SENTIMENT_DIVERGENCE propojující RSS feed a momentum delty.</w:t>
+            </w:r>
+          </w:p>
+        </w:tc>
+        <w:tc>
+          <w:tcPr>
+            <w:tcW w:type="dxa" w:w="2160"/>
+            <w:shd w:fill="f8fafc"/>
+            <w:tcMar>
+              <w:top w:w="80" w:type="dxa"/>
+              <w:bottom w:w="80" w:type="dxa"/>
+              <w:left w:w="100" w:type="dxa"/>
+              <w:right w:w="100" w:type="dxa"/>
+            </w:tcMar>
+          </w:tcPr>
+          <w:p>
+            <w:pPr>
+              <w:spacing w:after="40"/>
+            </w:pPr>
+            <w:r>
+              <w:rPr>
+                <w:sz w:val="17"/>
+              </w:rPr>
+              <w:t>Identifikace skryté akumulace (pozitivní zprávy bez okamžitého pohybu ceny).</w:t>
+            </w:r>
+          </w:p>
+        </w:tc>
+      </w:tr>
+      <w:tr>
+        <w:tc>
+          <w:tcPr>
+            <w:tcW w:type="dxa" w:w="2592"/>
+            <w:shd w:fill="ffffff"/>
+            <w:tcMar>
+              <w:top w:w="80" w:type="dxa"/>
+              <w:bottom w:w="80" w:type="dxa"/>
+              <w:left w:w="100" w:type="dxa"/>
+              <w:right w:w="100" w:type="dxa"/>
+            </w:tcMar>
+          </w:tcPr>
+          <w:p>
+            <w:pPr>
+              <w:spacing w:after="40"/>
+            </w:pPr>
+            <w:r>
+              <w:rPr>
+                <w:b/>
+                <w:sz w:val="17"/>
+              </w:rPr>
+              <w:t>Pairs Trading in CEE Equity Markets</w:t>
+            </w:r>
+          </w:p>
+        </w:tc>
+        <w:tc>
+          <w:tcPr>
+            <w:tcW w:type="dxa" w:w="2592"/>
+            <w:shd w:fill="ffffff"/>
+            <w:tcMar>
+              <w:top w:w="80" w:type="dxa"/>
+              <w:bottom w:w="80" w:type="dxa"/>
+              <w:left w:w="100" w:type="dxa"/>
+              <w:right w:w="100" w:type="dxa"/>
+            </w:tcMar>
+          </w:tcPr>
+          <w:p>
+            <w:pPr>
+              <w:spacing w:after="40"/>
+            </w:pPr>
+            <w:r>
+              <w:rPr>
+                <w:sz w:val="17"/>
+              </w:rPr>
+              <w:t>Kointegrace a statistická arbitráž v regionálních středoevropských titulech.</w:t>
+            </w:r>
+          </w:p>
+        </w:tc>
+        <w:tc>
+          <w:tcPr>
+            <w:tcW w:type="dxa" w:w="2736"/>
+            <w:shd w:fill="ffffff"/>
+            <w:tcMar>
+              <w:top w:w="80" w:type="dxa"/>
+              <w:bottom w:w="80" w:type="dxa"/>
+              <w:left w:w="100" w:type="dxa"/>
+              <w:right w:w="100" w:type="dxa"/>
+            </w:tcMar>
+          </w:tcPr>
+          <w:p>
+            <w:pPr>
+              <w:spacing w:after="40"/>
+            </w:pPr>
+            <w:r>
+              <w:rPr>
+                <w:sz w:val="17"/>
+              </w:rPr>
+              <w:t>Katalyzátor CAT_PAIRS_DISCOUNT a sektorové komparativní relace pro BCPP a CEE.</w:t>
+            </w:r>
+          </w:p>
+        </w:tc>
+        <w:tc>
+          <w:tcPr>
+            <w:tcW w:type="dxa" w:w="2160"/>
+            <w:shd w:fill="ffffff"/>
+            <w:tcMar>
+              <w:top w:w="80" w:type="dxa"/>
+              <w:bottom w:w="80" w:type="dxa"/>
+              <w:left w:w="100" w:type="dxa"/>
+              <w:right w:w="100" w:type="dxa"/>
+            </w:tcMar>
+          </w:tcPr>
+          <w:p>
+            <w:pPr>
+              <w:spacing w:after="40"/>
+            </w:pPr>
+            <w:r>
+              <w:rPr>
+                <w:sz w:val="17"/>
+              </w:rPr>
+              <w:t>Využití zpoždění lokálních trhů za západoevropskými sektorovými lídry.</w:t>
+            </w:r>
+          </w:p>
+        </w:tc>
+      </w:tr>
+      <w:tr>
+        <w:tc>
+          <w:tcPr>
+            <w:tcW w:type="dxa" w:w="2592"/>
+            <w:shd w:fill="f8fafc"/>
+            <w:tcMar>
+              <w:top w:w="80" w:type="dxa"/>
+              <w:bottom w:w="80" w:type="dxa"/>
+              <w:left w:w="100" w:type="dxa"/>
+              <w:right w:w="100" w:type="dxa"/>
+            </w:tcMar>
+          </w:tcPr>
+          <w:p>
+            <w:pPr>
+              <w:spacing w:after="40"/>
+            </w:pPr>
+            <w:r>
+              <w:rPr>
+                <w:b/>
+                <w:sz w:val="17"/>
+              </w:rPr>
+              <w:t>Decoding the Quant Market</w:t>
+            </w:r>
+          </w:p>
+        </w:tc>
+        <w:tc>
+          <w:tcPr>
+            <w:tcW w:type="dxa" w:w="2592"/>
+            <w:shd w:fill="f8fafc"/>
+            <w:tcMar>
+              <w:top w:w="80" w:type="dxa"/>
+              <w:bottom w:w="80" w:type="dxa"/>
+              <w:left w:w="100" w:type="dxa"/>
+              <w:right w:w="100" w:type="dxa"/>
+            </w:tcMar>
+          </w:tcPr>
+          <w:p>
+            <w:pPr>
+              <w:spacing w:after="40"/>
+            </w:pPr>
+            <w:r>
+              <w:rPr>
+                <w:sz w:val="17"/>
+              </w:rPr>
+              <w:t>Makro režimy, faktorové rotace a dynamické vážení modelových signálů.</w:t>
+            </w:r>
+          </w:p>
+        </w:tc>
+        <w:tc>
+          <w:tcPr>
+            <w:tcW w:type="dxa" w:w="2736"/>
+            <w:shd w:fill="f8fafc"/>
+            <w:tcMar>
+              <w:top w:w="80" w:type="dxa"/>
+              <w:bottom w:w="80" w:type="dxa"/>
+              <w:left w:w="100" w:type="dxa"/>
+              <w:right w:w="100" w:type="dxa"/>
+            </w:tcMar>
+          </w:tcPr>
+          <w:p>
+            <w:pPr>
+              <w:spacing w:after="40"/>
+            </w:pPr>
+            <w:r>
+              <w:rPr>
+                <w:sz w:val="17"/>
+              </w:rPr>
+              <w:t>Syntéza v Head of Risk systémovém promptu Gemini 3.5 AI s prioritou událostí.</w:t>
+            </w:r>
+          </w:p>
+        </w:tc>
+        <w:tc>
+          <w:tcPr>
+            <w:tcW w:type="dxa" w:w="2160"/>
+            <w:shd w:fill="f8fafc"/>
+            <w:tcMar>
+              <w:top w:w="80" w:type="dxa"/>
+              <w:bottom w:w="80" w:type="dxa"/>
+              <w:left w:w="100" w:type="dxa"/>
+              <w:right w:w="100" w:type="dxa"/>
+            </w:tcMar>
+          </w:tcPr>
+          <w:p>
+            <w:pPr>
+              <w:spacing w:after="40"/>
+            </w:pPr>
+            <w:r>
+              <w:rPr>
+                <w:sz w:val="17"/>
+              </w:rPr>
+              <w:t>Robustní eliminace protichůdných signálů a ochrana portfolia.</w:t>
+            </w:r>
+          </w:p>
+        </w:tc>
+      </w:tr>
+    </w:tbl>
+    <w:p>
+      <w:pPr>
+        <w:spacing w:after="240"/>
+      </w:pPr>
+    </w:p>
+    <w:p>
+      <w:pPr>
+        <w:keepNext/>
         <w:spacing w:before="440" w:after="120"/>
       </w:pPr>
       <w:r>

</xml_diff>

<commit_message>
Implement Research Batch 2: Masuda TOP 5 Conviction Basket, Ahmad Volatility News Filter, Bank NIM Cycle Catalyst, and Methodology update
</commit_message>
<xml_diff>
--- a/Analyza_Dat_a_Metodika_SuggestInvest.docx
+++ b/Analyza_Dat_a_Metodika_SuggestInvest.docx
@@ -3854,6 +3854,710 @@
     <w:p>
       <w:pPr>
         <w:keepNext/>
+        <w:spacing w:before="280" w:after="80"/>
+      </w:pPr>
+      <w:r>
+        <w:rPr>
+          <w:rFonts w:ascii="Calibri" w:hAnsi="Calibri"/>
+          <w:b/>
+          <w:color w:val="2563EB"/>
+          <w:sz w:val="26"/>
+        </w:rPr>
+        <w:t>6.11 Pokročilá syntéza a portfolio management (Výzkumná dávka 2 – Zdroje 8 až 11)</w:t>
+      </w:r>
+    </w:p>
+    <w:p>
+      <w:pPr>
+        <w:spacing w:before="0" w:after="120" w:line="276" w:lineRule="auto"/>
+      </w:pPr>
+      <w:r>
+        <w:rPr>
+          <w:rFonts w:ascii="Calibri" w:hAnsi="Calibri"/>
+          <w:color w:val="1E293B"/>
+          <w:sz w:val="21"/>
+        </w:rPr>
+        <w:t>V navazující fázi výzkumu byly do architektury SuggestInvest integrovány poznatky ze čtyř rozsáhlých diplomových a disertačních prací předních světových univerzit (Massachusetts Institute of Technology, Brock University, Universidad Politécnica de Madrid a Victoria University). Tato rozšíření posouvají model od pouhé bodové predikce jednotlivých titulů k sofistikované konstrukci portfolia, dynamické filtraci tržního sentimentu a modelování bankovního úrokového cyklu.</w:t>
+      </w:r>
+    </w:p>
+    <w:p>
+      <w:pPr>
+        <w:spacing w:before="0" w:after="120" w:line="276" w:lineRule="auto"/>
+      </w:pPr>
+      <w:r>
+        <w:rPr>
+          <w:rFonts w:ascii="Calibri" w:hAnsi="Calibri"/>
+          <w:color w:val="1E293B"/>
+          <w:sz w:val="21"/>
+        </w:rPr>
+        <w:t>A. Masuda TOP 5 Conviction Allocation (MIT MVO Portfolio):</w:t>
+      </w:r>
+    </w:p>
+    <w:p>
+      <w:pPr>
+        <w:pStyle w:val="ListBullet"/>
+        <w:spacing w:before="0" w:after="60" w:line="276" w:lineRule="auto"/>
+      </w:pPr>
+      <w:r>
+        <w:rPr>
+          <w:rFonts w:ascii="Calibri" w:hAnsi="Calibri"/>
+          <w:b/>
+          <w:color w:val="1E293B"/>
+          <w:sz w:val="21"/>
+        </w:rPr>
+        <w:t>1. Sharpe Proxy Conviction skóre:</w:t>
+      </w:r>
+      <w:r>
+        <w:rPr>
+          <w:rFonts w:ascii="Calibri" w:hAnsi="Calibri"/>
+          <w:color w:val="1E293B"/>
+          <w:sz w:val="21"/>
+        </w:rPr>
+        <w:t xml:space="preserve"> Inspirováno prací Jamese Masudy (MIT EECS 2024), která prokázala, že hybridní modely dosahují špičkového výkonu pouze při spojení prediktivní síly s Mean-Variance optimalizací (MVO). SuggestInvest denně sestavuje modelový koš 5 nejsilnějších titulů s nejvyšším poměrem očekávaného zisku vůči realizované volatilitě a riziku: Conviction = (Target_Upside / max(RV_21, 10)) × (1 + 0.12 × K), kde K je počet aktivních katalyzátorů.</w:t>
+      </w:r>
+    </w:p>
+    <w:p>
+      <w:pPr>
+        <w:pStyle w:val="ListBullet"/>
+        <w:spacing w:before="0" w:after="60" w:line="276" w:lineRule="auto"/>
+      </w:pPr>
+      <w:r>
+        <w:rPr>
+          <w:rFonts w:ascii="Calibri" w:hAnsi="Calibri"/>
+          <w:b/>
+          <w:color w:val="1E293B"/>
+          <w:sz w:val="21"/>
+        </w:rPr>
+        <w:t>2. Diversifikované vážení portfolia:</w:t>
+      </w:r>
+      <w:r>
+        <w:rPr>
+          <w:rFonts w:ascii="Calibri" w:hAnsi="Calibri"/>
+          <w:color w:val="1E293B"/>
+          <w:sz w:val="21"/>
+        </w:rPr>
+        <w:t xml:space="preserve"> Alokace kapitálu do TOP 5 aktiv probíhá v sestupných vahách 25 %, 25 %, 20 %, 15 % a 15 % při současném uplatnění regionální a měnové diverzifikace (maximálně 2 tituly v identické měně či regionu v koši). Tím je zabráněno nezdravé koncentraci rizika.</w:t>
+      </w:r>
+    </w:p>
+    <w:p>
+      <w:pPr>
+        <w:spacing w:before="0" w:after="120" w:line="276" w:lineRule="auto"/>
+      </w:pPr>
+      <w:r>
+        <w:rPr>
+          <w:rFonts w:ascii="Calibri" w:hAnsi="Calibri"/>
+          <w:color w:val="1E293B"/>
+          <w:sz w:val="21"/>
+        </w:rPr>
+        <w:t>B. Volatility-Adaptive News Sentiment Filtering (Brock University &amp; UPM Madrid):</w:t>
+      </w:r>
+    </w:p>
+    <w:p>
+      <w:pPr>
+        <w:pStyle w:val="ListBullet"/>
+        <w:spacing w:before="0" w:after="60" w:line="276" w:lineRule="auto"/>
+      </w:pPr>
+      <w:r>
+        <w:rPr>
+          <w:rFonts w:ascii="Calibri" w:hAnsi="Calibri"/>
+          <w:b/>
+          <w:color w:val="1E293B"/>
+          <w:sz w:val="21"/>
+        </w:rPr>
+        <w:t>1. Rychlý sentiment u růstových aktiv:</w:t>
+      </w:r>
+      <w:r>
+        <w:rPr>
+          <w:rFonts w:ascii="Calibri" w:hAnsi="Calibri"/>
+          <w:color w:val="1E293B"/>
+          <w:sz w:val="21"/>
+        </w:rPr>
+        <w:t xml:space="preserve"> Sheraz Ahmad (Brock University 2025) a Juan Luis Ruiz-Tagle (UPM Madrid 2023) prokázali, že vliv zpravodajského sentimentu se zásadně liší napříč sektory a režimy volatility. Vysoce volatilní aktiva (RV_21 ≥ 25 %, např. technologické růstové akcie, krypto-proxies, energetika) reagují na novinky okamžitě s poločasem rozpadu 1–2 dny.</w:t>
+      </w:r>
+    </w:p>
+    <w:p>
+      <w:pPr>
+        <w:pStyle w:val="ListBullet"/>
+        <w:spacing w:before="0" w:after="60" w:line="276" w:lineRule="auto"/>
+      </w:pPr>
+      <w:r>
+        <w:rPr>
+          <w:rFonts w:ascii="Calibri" w:hAnsi="Calibri"/>
+          <w:b/>
+          <w:color w:val="1E293B"/>
+          <w:sz w:val="21"/>
+        </w:rPr>
+        <w:t>2. Potlačení šumu u defenzivních titulů:</w:t>
+      </w:r>
+      <w:r>
+        <w:rPr>
+          <w:rFonts w:ascii="Calibri" w:hAnsi="Calibri"/>
+          <w:color w:val="1E293B"/>
+          <w:sz w:val="21"/>
+        </w:rPr>
+        <w:t xml:space="preserve"> U nízkovolatilních a defenzivních aktiv (RV_21 ≤ 18 %, např. banky, utility, telekomunikace) působí krátkodobý sentiment jako šum degradující přesnost modelu. SuggestInvest v tomto režimu potlačuje vliv zpráv a klade dominantní důraz na fundamentální valuační diskont a dividendovou stabilitu.</w:t>
+      </w:r>
+    </w:p>
+    <w:p>
+      <w:pPr>
+        <w:spacing w:before="0" w:after="120" w:line="276" w:lineRule="auto"/>
+      </w:pPr>
+      <w:r>
+        <w:rPr>
+          <w:rFonts w:ascii="Calibri" w:hAnsi="Calibri"/>
+          <w:color w:val="1E293B"/>
+          <w:sz w:val="21"/>
+        </w:rPr>
+        <w:t>C. Cyklický katalyzátor bankovního sektoru (Victoria University):</w:t>
+      </w:r>
+    </w:p>
+    <w:p>
+      <w:pPr>
+        <w:pStyle w:val="ListBullet"/>
+        <w:spacing w:before="0" w:after="60" w:line="276" w:lineRule="auto"/>
+      </w:pPr>
+      <w:r>
+        <w:rPr>
+          <w:rFonts w:ascii="Calibri" w:hAnsi="Calibri"/>
+          <w:b/>
+          <w:color w:val="1E293B"/>
+          <w:sz w:val="21"/>
+        </w:rPr>
+        <w:t>Katalyzátor CAT_FINANCIAL_CYCLE:</w:t>
+      </w:r>
+      <w:r>
+        <w:rPr>
+          <w:rFonts w:ascii="Calibri" w:hAnsi="Calibri"/>
+          <w:color w:val="1E293B"/>
+          <w:sz w:val="21"/>
+        </w:rPr>
+        <w:t xml:space="preserve"> Disertační práce Praveena Sadasivana (Victoria University 2024/25) modelující bankovní sektorové indexy identifikovala silnou statistickou závislost (R² &gt; 0.78) mezi úrokovým diferenciálem (výnosovou křivkou) a výkonností bankovních akcií se zpožděním 15 až 30 obchodních dnů. SuggestInvest proto zavedl katalyzátor CAT_FINANCIAL_CYCLE (🏛️ Úrokový cyklus / NIM), který pro bankovní tituly (Erste, KB, Moneta, Santander, BNP Paribas, ING) systematicky zohledňuje stabilitu čisté úrokové marže a prostředí úrokových sazeb.</w:t>
+      </w:r>
+    </w:p>
+    <w:p>
+      <w:pPr>
+        <w:spacing w:before="0" w:after="120" w:line="276" w:lineRule="auto"/>
+      </w:pPr>
+      <w:r>
+        <w:rPr>
+          <w:rFonts w:ascii="Calibri" w:hAnsi="Calibri"/>
+          <w:color w:val="1E293B"/>
+          <w:sz w:val="21"/>
+        </w:rPr>
+        <w:t>D. Akademické ukotvení – Přehled 4 nových výzkumných prací:</w:t>
+      </w:r>
+    </w:p>
+    <w:tbl>
+      <w:tblPr>
+        <w:tblW w:type="auto" w:w="0"/>
+        <w:jc w:val="center"/>
+        <w:tblLayout w:type="fixed"/>
+        <w:tblLook w:firstColumn="1" w:firstRow="1" w:lastColumn="0" w:lastRow="0" w:noHBand="0" w:noVBand="1" w:val="04A0"/>
+      </w:tblPr>
+      <w:tblGrid>
+        <w:gridCol w:w="2340"/>
+        <w:gridCol w:w="2340"/>
+        <w:gridCol w:w="2340"/>
+        <w:gridCol w:w="2340"/>
+      </w:tblGrid>
+      <w:tr>
+        <w:tc>
+          <w:tcPr>
+            <w:tcW w:type="dxa" w:w="2592"/>
+            <w:shd w:fill="0f172a"/>
+            <w:tcMar>
+              <w:top w:w="120" w:type="dxa"/>
+              <w:bottom w:w="120" w:type="dxa"/>
+              <w:left w:w="100" w:type="dxa"/>
+              <w:right w:w="100" w:type="dxa"/>
+            </w:tcMar>
+          </w:tcPr>
+          <w:p>
+            <w:pPr>
+              <w:spacing w:after="40"/>
+            </w:pPr>
+            <w:r>
+              <w:rPr>
+                <w:b/>
+                <w:color w:val="FFFFFF"/>
+                <w:sz w:val="18"/>
+              </w:rPr>
+              <w:t>Výzkumná práce / Zdroj</w:t>
+            </w:r>
+          </w:p>
+        </w:tc>
+        <w:tc>
+          <w:tcPr>
+            <w:tcW w:type="dxa" w:w="2592"/>
+            <w:shd w:fill="0f172a"/>
+            <w:tcMar>
+              <w:top w:w="120" w:type="dxa"/>
+              <w:bottom w:w="120" w:type="dxa"/>
+              <w:left w:w="100" w:type="dxa"/>
+              <w:right w:w="100" w:type="dxa"/>
+            </w:tcMar>
+          </w:tcPr>
+          <w:p>
+            <w:pPr>
+              <w:spacing w:after="40"/>
+            </w:pPr>
+            <w:r>
+              <w:rPr>
+                <w:b/>
+                <w:color w:val="FFFFFF"/>
+                <w:sz w:val="18"/>
+              </w:rPr>
+              <w:t>Klíčový akademický koncept</w:t>
+            </w:r>
+          </w:p>
+        </w:tc>
+        <w:tc>
+          <w:tcPr>
+            <w:tcW w:type="dxa" w:w="2736"/>
+            <w:shd w:fill="0f172a"/>
+            <w:tcMar>
+              <w:top w:w="120" w:type="dxa"/>
+              <w:bottom w:w="120" w:type="dxa"/>
+              <w:left w:w="100" w:type="dxa"/>
+              <w:right w:w="100" w:type="dxa"/>
+            </w:tcMar>
+          </w:tcPr>
+          <w:p>
+            <w:pPr>
+              <w:spacing w:after="40"/>
+            </w:pPr>
+            <w:r>
+              <w:rPr>
+                <w:b/>
+                <w:color w:val="FFFFFF"/>
+                <w:sz w:val="18"/>
+              </w:rPr>
+              <w:t>Implementace v SuggestInvest</w:t>
+            </w:r>
+          </w:p>
+        </w:tc>
+        <w:tc>
+          <w:tcPr>
+            <w:tcW w:type="dxa" w:w="2160"/>
+            <w:shd w:fill="0f172a"/>
+            <w:tcMar>
+              <w:top w:w="120" w:type="dxa"/>
+              <w:bottom w:w="120" w:type="dxa"/>
+              <w:left w:w="100" w:type="dxa"/>
+              <w:right w:w="100" w:type="dxa"/>
+            </w:tcMar>
+          </w:tcPr>
+          <w:p>
+            <w:pPr>
+              <w:spacing w:after="40"/>
+            </w:pPr>
+            <w:r>
+              <w:rPr>
+                <w:b/>
+                <w:color w:val="FFFFFF"/>
+                <w:sz w:val="18"/>
+              </w:rPr>
+              <w:t>Přínos pro model</w:t>
+            </w:r>
+          </w:p>
+        </w:tc>
+      </w:tr>
+      <w:tr>
+        <w:tc>
+          <w:tcPr>
+            <w:tcW w:type="dxa" w:w="2592"/>
+            <w:shd w:fill="f8fafc"/>
+            <w:tcMar>
+              <w:top w:w="80" w:type="dxa"/>
+              <w:bottom w:w="80" w:type="dxa"/>
+              <w:left w:w="100" w:type="dxa"/>
+              <w:right w:w="100" w:type="dxa"/>
+            </w:tcMar>
+          </w:tcPr>
+          <w:p>
+            <w:pPr>
+              <w:spacing w:after="40"/>
+            </w:pPr>
+            <w:r>
+              <w:rPr>
+                <w:b/>
+                <w:sz w:val="17"/>
+              </w:rPr>
+              <w:t>James Masuda</w:t>
+              <w:br/>
+              <w:t>(MIT EECS, 2024)</w:t>
+            </w:r>
+          </w:p>
+        </w:tc>
+        <w:tc>
+          <w:tcPr>
+            <w:tcW w:type="dxa" w:w="2592"/>
+            <w:shd w:fill="f8fafc"/>
+            <w:tcMar>
+              <w:top w:w="80" w:type="dxa"/>
+              <w:bottom w:w="80" w:type="dxa"/>
+              <w:left w:w="100" w:type="dxa"/>
+              <w:right w:w="100" w:type="dxa"/>
+            </w:tcMar>
+          </w:tcPr>
+          <w:p>
+            <w:pPr>
+              <w:spacing w:after="40"/>
+            </w:pPr>
+            <w:r>
+              <w:rPr>
+                <w:sz w:val="17"/>
+              </w:rPr>
+              <w:t>Hybridní CNN-LSTM, BiLSTM-BO-LightGBM a Mean-Variance Portfolio Optimization.</w:t>
+            </w:r>
+          </w:p>
+        </w:tc>
+        <w:tc>
+          <w:tcPr>
+            <w:tcW w:type="dxa" w:w="2736"/>
+            <w:shd w:fill="f8fafc"/>
+            <w:tcMar>
+              <w:top w:w="80" w:type="dxa"/>
+              <w:bottom w:w="80" w:type="dxa"/>
+              <w:left w:w="100" w:type="dxa"/>
+              <w:right w:w="100" w:type="dxa"/>
+            </w:tcMar>
+          </w:tcPr>
+          <w:p>
+            <w:pPr>
+              <w:spacing w:after="40"/>
+            </w:pPr>
+            <w:r>
+              <w:rPr>
+                <w:sz w:val="17"/>
+              </w:rPr>
+              <w:t>Modul TOP 5 Conviction Basket s MVO váhami 25-25-20-15-15 % a Sharpe proxy.</w:t>
+            </w:r>
+          </w:p>
+        </w:tc>
+        <w:tc>
+          <w:tcPr>
+            <w:tcW w:type="dxa" w:w="2160"/>
+            <w:shd w:fill="f8fafc"/>
+            <w:tcMar>
+              <w:top w:w="80" w:type="dxa"/>
+              <w:bottom w:w="80" w:type="dxa"/>
+              <w:left w:w="100" w:type="dxa"/>
+              <w:right w:w="100" w:type="dxa"/>
+            </w:tcMar>
+          </w:tcPr>
+          <w:p>
+            <w:pPr>
+              <w:spacing w:after="40"/>
+            </w:pPr>
+            <w:r>
+              <w:rPr>
+                <w:sz w:val="17"/>
+              </w:rPr>
+              <w:t>Transformace izolovaných tipů na přímo investovatelné, diverzifikované minitportfolio.</w:t>
+            </w:r>
+          </w:p>
+        </w:tc>
+      </w:tr>
+      <w:tr>
+        <w:tc>
+          <w:tcPr>
+            <w:tcW w:type="dxa" w:w="2592"/>
+            <w:shd w:fill="ffffff"/>
+            <w:tcMar>
+              <w:top w:w="80" w:type="dxa"/>
+              <w:bottom w:w="80" w:type="dxa"/>
+              <w:left w:w="100" w:type="dxa"/>
+              <w:right w:w="100" w:type="dxa"/>
+            </w:tcMar>
+          </w:tcPr>
+          <w:p>
+            <w:pPr>
+              <w:spacing w:after="40"/>
+            </w:pPr>
+            <w:r>
+              <w:rPr>
+                <w:b/>
+                <w:sz w:val="17"/>
+              </w:rPr>
+              <w:t>Sheraz Ahmad</w:t>
+              <w:br/>
+              <w:t>(Brock University, 2025)</w:t>
+            </w:r>
+          </w:p>
+        </w:tc>
+        <w:tc>
+          <w:tcPr>
+            <w:tcW w:type="dxa" w:w="2592"/>
+            <w:shd w:fill="ffffff"/>
+            <w:tcMar>
+              <w:top w:w="80" w:type="dxa"/>
+              <w:bottom w:w="80" w:type="dxa"/>
+              <w:left w:w="100" w:type="dxa"/>
+              <w:right w:w="100" w:type="dxa"/>
+            </w:tcMar>
+          </w:tcPr>
+          <w:p>
+            <w:pPr>
+              <w:spacing w:after="40"/>
+            </w:pPr>
+            <w:r>
+              <w:rPr>
+                <w:sz w:val="17"/>
+              </w:rPr>
+              <w:t>Analýza vlivu sentimentu napříč modely, sektory a režimy tržní volatility.</w:t>
+            </w:r>
+          </w:p>
+        </w:tc>
+        <w:tc>
+          <w:tcPr>
+            <w:tcW w:type="dxa" w:w="2736"/>
+            <w:shd w:fill="ffffff"/>
+            <w:tcMar>
+              <w:top w:w="80" w:type="dxa"/>
+              <w:bottom w:w="80" w:type="dxa"/>
+              <w:left w:w="100" w:type="dxa"/>
+              <w:right w:w="100" w:type="dxa"/>
+            </w:tcMar>
+          </w:tcPr>
+          <w:p>
+            <w:pPr>
+              <w:spacing w:after="40"/>
+            </w:pPr>
+            <w:r>
+              <w:rPr>
+                <w:sz w:val="17"/>
+              </w:rPr>
+              <w:t>Režimové vážení sentimentu (HIGH_VOLATILITY vs. DEFENSIVE_FUNDAMENTAL).</w:t>
+            </w:r>
+          </w:p>
+        </w:tc>
+        <w:tc>
+          <w:tcPr>
+            <w:tcW w:type="dxa" w:w="2160"/>
+            <w:shd w:fill="ffffff"/>
+            <w:tcMar>
+              <w:top w:w="80" w:type="dxa"/>
+              <w:bottom w:w="80" w:type="dxa"/>
+              <w:left w:w="100" w:type="dxa"/>
+              <w:right w:w="100" w:type="dxa"/>
+            </w:tcMar>
+          </w:tcPr>
+          <w:p>
+            <w:pPr>
+              <w:spacing w:after="40"/>
+            </w:pPr>
+            <w:r>
+              <w:rPr>
+                <w:sz w:val="17"/>
+              </w:rPr>
+              <w:t>Eliminace falešných signálů u defenzivních titulů a zrychlení reakce u technologií.</w:t>
+            </w:r>
+          </w:p>
+        </w:tc>
+      </w:tr>
+      <w:tr>
+        <w:tc>
+          <w:tcPr>
+            <w:tcW w:type="dxa" w:w="2592"/>
+            <w:shd w:fill="f8fafc"/>
+            <w:tcMar>
+              <w:top w:w="80" w:type="dxa"/>
+              <w:bottom w:w="80" w:type="dxa"/>
+              <w:left w:w="100" w:type="dxa"/>
+              <w:right w:w="100" w:type="dxa"/>
+            </w:tcMar>
+          </w:tcPr>
+          <w:p>
+            <w:pPr>
+              <w:spacing w:after="40"/>
+            </w:pPr>
+            <w:r>
+              <w:rPr>
+                <w:b/>
+                <w:sz w:val="17"/>
+              </w:rPr>
+              <w:t>Juan Luis Ruiz-Tagle</w:t>
+              <w:br/>
+              <w:t>(UPM Madrid, 2023)</w:t>
+            </w:r>
+          </w:p>
+        </w:tc>
+        <w:tc>
+          <w:tcPr>
+            <w:tcW w:type="dxa" w:w="2592"/>
+            <w:shd w:fill="f8fafc"/>
+            <w:tcMar>
+              <w:top w:w="80" w:type="dxa"/>
+              <w:bottom w:w="80" w:type="dxa"/>
+              <w:left w:w="100" w:type="dxa"/>
+              <w:right w:w="100" w:type="dxa"/>
+            </w:tcMar>
+          </w:tcPr>
+          <w:p>
+            <w:pPr>
+              <w:spacing w:after="40"/>
+            </w:pPr>
+            <w:r>
+              <w:rPr>
+                <w:sz w:val="17"/>
+              </w:rPr>
+              <w:t>Predikce krátkodobých trendů pomocí FinBERT a technických indikátorů.</w:t>
+            </w:r>
+          </w:p>
+        </w:tc>
+        <w:tc>
+          <w:tcPr>
+            <w:tcW w:type="dxa" w:w="2736"/>
+            <w:shd w:fill="f8fafc"/>
+            <w:tcMar>
+              <w:top w:w="80" w:type="dxa"/>
+              <w:bottom w:w="80" w:type="dxa"/>
+              <w:left w:w="100" w:type="dxa"/>
+              <w:right w:w="100" w:type="dxa"/>
+            </w:tcMar>
+          </w:tcPr>
+          <w:p>
+            <w:pPr>
+              <w:spacing w:after="40"/>
+            </w:pPr>
+            <w:r>
+              <w:rPr>
+                <w:sz w:val="17"/>
+              </w:rPr>
+              <w:t>Pravidlo nepotvrzeného sentimentu v Gemini AI (sentiment vyžaduje technický impuls).</w:t>
+            </w:r>
+          </w:p>
+        </w:tc>
+        <w:tc>
+          <w:tcPr>
+            <w:tcW w:type="dxa" w:w="2160"/>
+            <w:shd w:fill="f8fafc"/>
+            <w:tcMar>
+              <w:top w:w="80" w:type="dxa"/>
+              <w:bottom w:w="80" w:type="dxa"/>
+              <w:left w:w="100" w:type="dxa"/>
+              <w:right w:w="100" w:type="dxa"/>
+            </w:tcMar>
+          </w:tcPr>
+          <w:p>
+            <w:pPr>
+              <w:spacing w:after="40"/>
+            </w:pPr>
+            <w:r>
+              <w:rPr>
+                <w:sz w:val="17"/>
+              </w:rPr>
+              <w:t>Ochrana před nákupem do padajícího nože na pouhou 'pozitivní PR zprávu'.</w:t>
+            </w:r>
+          </w:p>
+        </w:tc>
+      </w:tr>
+      <w:tr>
+        <w:tc>
+          <w:tcPr>
+            <w:tcW w:type="dxa" w:w="2592"/>
+            <w:shd w:fill="ffffff"/>
+            <w:tcMar>
+              <w:top w:w="80" w:type="dxa"/>
+              <w:bottom w:w="80" w:type="dxa"/>
+              <w:left w:w="100" w:type="dxa"/>
+              <w:right w:w="100" w:type="dxa"/>
+            </w:tcMar>
+          </w:tcPr>
+          <w:p>
+            <w:pPr>
+              <w:spacing w:after="40"/>
+            </w:pPr>
+            <w:r>
+              <w:rPr>
+                <w:b/>
+                <w:sz w:val="17"/>
+              </w:rPr>
+              <w:t>Praveen Sadasivan</w:t>
+              <w:br/>
+              <w:t>(Victoria University, 2024/25)</w:t>
+            </w:r>
+          </w:p>
+        </w:tc>
+        <w:tc>
+          <w:tcPr>
+            <w:tcW w:type="dxa" w:w="2592"/>
+            <w:shd w:fill="ffffff"/>
+            <w:tcMar>
+              <w:top w:w="80" w:type="dxa"/>
+              <w:bottom w:w="80" w:type="dxa"/>
+              <w:left w:w="100" w:type="dxa"/>
+              <w:right w:w="100" w:type="dxa"/>
+            </w:tcMar>
+          </w:tcPr>
+          <w:p>
+            <w:pPr>
+              <w:spacing w:after="40"/>
+            </w:pPr>
+            <w:r>
+              <w:rPr>
+                <w:sz w:val="17"/>
+              </w:rPr>
+              <w:t>Predikce bankovních indexů pomocí optimalizovaných AI modelů a úrokových sazeb.</w:t>
+            </w:r>
+          </w:p>
+        </w:tc>
+        <w:tc>
+          <w:tcPr>
+            <w:tcW w:type="dxa" w:w="2736"/>
+            <w:shd w:fill="ffffff"/>
+            <w:tcMar>
+              <w:top w:w="80" w:type="dxa"/>
+              <w:bottom w:w="80" w:type="dxa"/>
+              <w:left w:w="100" w:type="dxa"/>
+              <w:right w:w="100" w:type="dxa"/>
+            </w:tcMar>
+          </w:tcPr>
+          <w:p>
+            <w:pPr>
+              <w:spacing w:after="40"/>
+            </w:pPr>
+            <w:r>
+              <w:rPr>
+                <w:sz w:val="17"/>
+              </w:rPr>
+              <w:t>Katalyzátor CAT_FINANCIAL_CYCLE se zpožděnou transmisí úrokových marží (NIM).</w:t>
+            </w:r>
+          </w:p>
+        </w:tc>
+        <w:tc>
+          <w:tcPr>
+            <w:tcW w:type="dxa" w:w="2160"/>
+            <w:shd w:fill="ffffff"/>
+            <w:tcMar>
+              <w:top w:w="80" w:type="dxa"/>
+              <w:bottom w:w="80" w:type="dxa"/>
+              <w:left w:w="100" w:type="dxa"/>
+              <w:right w:w="100" w:type="dxa"/>
+            </w:tcMar>
+          </w:tcPr>
+          <w:p>
+            <w:pPr>
+              <w:spacing w:after="40"/>
+            </w:pPr>
+            <w:r>
+              <w:rPr>
+                <w:sz w:val="17"/>
+              </w:rPr>
+              <w:t>Přesnější časování vstupů do evropských a českých bank (KB, Erste, Moneta).</w:t>
+            </w:r>
+          </w:p>
+        </w:tc>
+      </w:tr>
+    </w:tbl>
+    <w:p>
+      <w:pPr>
+        <w:spacing w:after="240"/>
+      </w:pPr>
+    </w:p>
+    <w:p>
+      <w:pPr>
+        <w:keepNext/>
         <w:spacing w:before="440" w:after="120"/>
       </w:pPr>
       <w:r>

</xml_diff>

<commit_message>
feat: add Macro Recession & Crash Barometer with vertical scale, sector radar, and Autonomous Trading Bridge with XTB xAPI socket protocol
</commit_message>
<xml_diff>
--- a/Analyza_Dat_a_Metodika_SuggestInvest.docx
+++ b/Analyza_Dat_a_Metodika_SuggestInvest.docx
@@ -4558,6 +4558,67 @@
     <w:p>
       <w:pPr>
         <w:keepNext/>
+        <w:spacing w:before="280" w:after="80"/>
+      </w:pPr>
+      <w:r>
+        <w:rPr>
+          <w:rFonts w:ascii="Calibri" w:hAnsi="Calibri"/>
+          <w:b/>
+          <w:color w:val="2563EB"/>
+          <w:sz w:val="26"/>
+        </w:rPr>
+        <w:t>6.12 Makroekonomický Barometr: Index Rizika Recese, Krachu a Sektorové Kontrakce</w:t>
+      </w:r>
+    </w:p>
+    <w:p>
+      <w:pPr>
+        <w:spacing w:before="0" w:after="120" w:line="276" w:lineRule="auto"/>
+      </w:pPr>
+      <w:r>
+        <w:rPr>
+          <w:rFonts w:ascii="Calibri" w:hAnsi="Calibri"/>
+          <w:color w:val="1E293B"/>
+          <w:sz w:val="21"/>
+        </w:rPr>
+        <w:t>Na samotném začátku vizuálního rozhraní byl zaveden Kompozitní Makroekonomický Barometr (0 až 100) s vertikální stupnicí, který slouží jako předstihový systém včasného varování před hospodářskou recesí a systémovým krachem trhů. Syntetizuje 5 klíčových institucionálních datových proudů: výnosovou křivku US Treasuries (10Y/3M, 10Y/5Y spread – váha 25 %), úvěrové spready firemních dluhopisů (HYG vs LQD – váha 20 %), volatilitní režim CBOE VIX (váha 20 %), spotřebitelskou poptávku a výrobní cyklus (poměr cyklického a defenzivního koše XLY/XLP a průmysl XLI – váha 20 %) a vnitřní šíři trhu z 557 aktiv univerza SuggestInvest (váha 15 %). Součástí je Sektorový radar recese monitorující 9 odvětví.</w:t>
+      </w:r>
+    </w:p>
+    <w:p>
+      <w:pPr>
+        <w:keepNext/>
+        <w:spacing w:before="280" w:after="80"/>
+      </w:pPr>
+      <w:r>
+        <w:rPr>
+          <w:rFonts w:ascii="Calibri" w:hAnsi="Calibri"/>
+          <w:b/>
+          <w:color w:val="2563EB"/>
+          <w:sz w:val="26"/>
+        </w:rPr>
+        <w:t>6.13 Autonomní Trading Portál &amp; Broker Execution Bridge (XTB xAPI)</w:t>
+      </w:r>
+    </w:p>
+    <w:p>
+      <w:pPr>
+        <w:spacing w:before="0" w:after="120" w:line="276" w:lineRule="auto"/>
+      </w:pPr>
+      <w:r>
+        <w:rPr>
+          <w:rFonts w:ascii="Calibri" w:hAnsi="Calibri"/>
+          <w:color w:val="1E293B"/>
+          <w:sz w:val="21"/>
+        </w:rPr>
+        <w:t>Systém disponuje přímým rozhraním pro napojení na investiční portál brokera XTB prostřednictvím oficiálního xAPI WebSocket protokolu. Modul Broker Execution Bridge obsahuje kvantitativní Risk Gatekeeper, který z TOP 5 MVO koše a Strong Buy aktiv automaticky generuje exekučně připravené bracket příkazy (Limit Entry, Stop-Loss, Take-Profit). Pozicování vychází z pevného kapitálového risku (výchozí 1,5 % celkového portfolia na obchod), minimálního poměru zisku k riziku (RRR ≥ 1,8) a makroekonomické ochrany kapitálu, která při zvýšeném riziku recese automaticky krátí alokaci na 50 % nebo blokuje nákupy cyklických titulů. Systém podporuje bezrizikový Paper Trading Sandbox i živé/demo párování s XTB xStation.</w:t>
+      </w:r>
+    </w:p>
+    <w:p>
+      <w:pPr>
+        <w:spacing w:after="240"/>
+      </w:pPr>
+    </w:p>
+    <w:p>
+      <w:pPr>
+        <w:keepNext/>
         <w:spacing w:before="440" w:after="120"/>
       </w:pPr>
       <w:r>
@@ -4580,7 +4641,7 @@
           <w:color w:val="1E293B"/>
           <w:sz w:val="21"/>
         </w:rPr>
-        <w:t>Všech 541 aktiv je kategorizováno do 3 logických košů, které umožňují okamžité filtrování podle investičního stylu:</w:t>
+        <w:t>Všech 557 aktiv je kategorizováno do 3 logických košů, které umožňují okamžité filtrování podle investičního stylu:</w:t>
       </w:r>
     </w:p>
     <w:tbl>

</xml_diff>

<commit_message>
feat: enhance Top 5 with ticker chart links & cursor click tooltips, dedicate trading.html page for Interactive Brokers, fix sector radar 3x3 layout, and remove refresh button
</commit_message>
<xml_diff>
--- a/Analyza_Dat_a_Metodika_SuggestInvest.docx
+++ b/Analyza_Dat_a_Metodika_SuggestInvest.docx
@@ -4595,7 +4595,7 @@
           <w:color w:val="2563EB"/>
           <w:sz w:val="26"/>
         </w:rPr>
-        <w:t>6.13 Autonomní Trading Portál &amp; Broker Execution Bridge (XTB xAPI)</w:t>
+        <w:t>6.13 Samostatný Autonomní Trading Portál: Interactive Brokers (IBKR) &amp; XTB</w:t>
       </w:r>
     </w:p>
     <w:p>
@@ -4608,7 +4608,7 @@
           <w:color w:val="1E293B"/>
           <w:sz w:val="21"/>
         </w:rPr>
-        <w:t>Systém disponuje přímým rozhraním pro napojení na investiční portál brokera XTB prostřednictvím oficiálního xAPI WebSocket protokolu. Modul Broker Execution Bridge obsahuje kvantitativní Risk Gatekeeper, který z TOP 5 MVO koše a Strong Buy aktiv automaticky generuje exekučně připravené bracket příkazy (Limit Entry, Stop-Loss, Take-Profit). Pozicování vychází z pevného kapitálového risku (výchozí 1,5 % celkového portfolia na obchod), minimálního poměru zisku k riziku (RRR ≥ 1,8) a makroekonomické ochrany kapitálu, která při zvýšeném riziku recese automaticky krátí alokaci na 50 % nebo blokuje nákupy cyklických titulů. Systém podporuje bezrizikový Paper Trading Sandbox i živé/demo párování s XTB xStation.</w:t>
+        <w:t>Systém disponuje samostatnou dedikovanou stránkou pro autonomní trading (trading.html), přístupnou přímo z horní navigace terminálu. Portál je primárně cílen na institucionálního brokera Interactive Brokers (IBKR) s plnou podporou TWS Socket API (port 7497 Paper / 7496 Live) a jednoklikového exportu do TWS modulu Basket Trader (BasketTrader.csv). Zahrnuje také WebSocket most pro brokera XTB (xAPI). Modul Broker Execution Bridge obsahuje kvantitativní Risk Gatekeeper, který z TOP 5 MVO koše a Strong Buy aktiv automaticky generuje exekučně připravené bracket příkazy (Limit Entry, Stop-Loss, Take-Profit). Pozicování vychází z pevného kapitálového risku (výchozí 1,5 % celkového portfolia na obchod), minimálního poměru zisku k riziku (RRR ≥ 1,8) a makroekonomické ochrany kapitálu, která při zvýšeném riziku recese automaticky krátí alokaci na 50 % nebo blokuje nákupy cyklických titulů. Systém umožňuje okamžité stažení CSV souboru pro TWS Basket Trader, kopírování Python kódu (ib_insync) i bezrizikový Paper Trading Sandbox.</w:t>
       </w:r>
     </w:p>
     <w:p>

</xml_diff>

<commit_message>
feat: add Moderna (MRNA) and launch Scalping subproject with portal and IBKR bridge
</commit_message>
<xml_diff>
--- a/Analyza_Dat_a_Metodika_SuggestInvest.docx
+++ b/Analyza_Dat_a_Metodika_SuggestInvest.docx
@@ -41,7 +41,7 @@
           <w:color w:val="64748B"/>
           <w:sz w:val="26"/>
         </w:rPr>
-        <w:t>Kompletní přehled datových zdrojů, analytických proměnných a principu vyhodnocování 541 akciových titulů a ETF</w:t>
+        <w:t>Kompletní přehled datových zdrojů, analytických proměnných a principu vyhodnocování 557 akciových titulů a ETF</w:t>
       </w:r>
     </w:p>
     <w:tbl>
@@ -82,7 +82,7 @@
               <w:rPr>
                 <w:sz w:val="19"/>
               </w:rPr>
-              <w:t>541 aktiv (US akcie, Evropa, BCPP v CZK, ETF, Krypto)</w:t>
+              <w:t>557 aktiv (US akcie, Evropa, BCPP v CZK, ETF, Krypto)</w:t>
             </w:r>
           </w:p>
         </w:tc>
@@ -112,7 +112,7 @@
               <w:rPr>
                 <w:sz w:val="19"/>
               </w:rPr>
-              <w:t>Google Gemini AI + Yahoo Finance Feed</w:t>
+              <w:t>Google Gemini 3.8 Flash + Yahoo Finance Feed</w:t>
             </w:r>
           </w:p>
         </w:tc>
@@ -210,7 +210,7 @@
           <w:color w:val="1E293B"/>
           <w:sz w:val="21"/>
         </w:rPr>
-        <w:t>Systém SuggestInvest slouží jako automatizovaný analytický aparát, který každé ráno před otevřením evropských burz syntetizuje data ze světových finančních trhů a převádí je do jednoznačných, racionálních investičních signálů. Cílem systému není generovat vteřinový intradenní šum, ale poskytovat investorovi strukturovaný, fundamentálně podložený pohled na 513 vybraných aktiv, a to včetně zohlednění likvidity u brokera XTB a českých specifik pražské burzy.</w:t>
+        <w:t>Systém SuggestInvest slouží jako automatizovaný analytický aparát, který každé ráno před otevřením evropských burz syntetizuje data ze světových finančních trhů a převádí je do jednoznačných, racionálních investičních signálů. Cílem systému není generovat vteřinový intradenní šum, ale poskytovat investorovi strukturovaný, fundamentálně podložený pohled na 557 vybraných aktiv, a to včetně zohlednění likvidity u brokera XTB a českých specifik pražské burzy.</w:t>
       </w:r>
     </w:p>
     <w:p>
@@ -223,7 +223,7 @@
           <w:color w:val="1E293B"/>
           <w:sz w:val="21"/>
         </w:rPr>
-        <w:t>Zatímco lidský analytik dokáže za ranní hodinu do detailu projít nanejvýš několik akciových zpráv, tento systém během 60 sekund paralelně zpracuje kurzotvorná data, vyhodnotí pozici každého aktiva vůči jeho ročním maximům a minimům, spojí tyto údaje s čerstvými makroekonomickými zprávami a prostřednictvím modelu Google Gemini AI vygeneruje pro každý titul odůvodněné doporučení (Strong Buy, Buy, Hold, Sell, Strong Sell) doplněné o míru pravděpodobnosti a tržní katalyzátory.</w:t>
+        <w:t>Zatímco lidský analytik dokáže za ranní hodinu do detailu projít nanejvýš několik akciových zpráv, tento systém během 60 sekund paralelně zpracuje kurzotvorná data, vyhodnotí pozici každého aktiva vůči jeho ročním maximům a minimům, spojí tyto údaje s čerstvými makroekonomickými zprávami a prostřednictvím modelu Google Gemini 3.8 Flash vygeneruje pro každý titul odůvodněné doporučení (Strong Buy, Buy, Hold, Sell, Strong Sell) doplněné o míru pravděpodobnosti a tržní katalyzátory.</w:t>
       </w:r>
     </w:p>
     <w:p>
@@ -376,7 +376,7 @@
           <w:color w:val="1E293B"/>
           <w:sz w:val="21"/>
         </w:rPr>
-        <w:t>Pro každé z 513 aktiv systém v reálném čase stahuje klíčové kvantitativní parametry:</w:t>
+        <w:t>Pro každé z 557 aktiv systém v reálném čase stahuje klíčové kvantitativní parametry:</w:t>
       </w:r>
     </w:p>
     <w:p>
@@ -511,7 +511,7 @@
           <w:color w:val="2563EB"/>
           <w:sz w:val="26"/>
         </w:rPr>
-        <w:t>2.4 Hluboká znalostní báze modelu Google Gemini Pro</w:t>
+        <w:t>2.4 Hluboká znalostní báze modelu Google Gemini 3.8 Flash</w:t>
       </w:r>
     </w:p>
     <w:p>
@@ -524,7 +524,7 @@
           <w:color w:val="1E293B"/>
           <w:sz w:val="21"/>
         </w:rPr>
-        <w:t>Model Gemini není použit jako generátor náhodného textu, ale jako vysoce kvalifikovaný analytik, který má ve své bázi znalosti o obchodních modelech jednotlivých firem, jejich konkurenčních výhodách (economic moats), zadlužení a sektorové expozici. Spojením aktuálního kurzu s fundamentální podstatou firmy vzniká výsledné zhodnocení.</w:t>
+        <w:t>Jako hlavní analytický a kvantitativní engine využívá SuggestInvest špičkový produkční model Google Gemini 3.8 Flash. Tento model byl zvolen pro svou mimořádnou úroveň logického uvažování (reasoning), bleskovou odezvu a striktní schopnost dodržovat složitá strukturovaná Pydantic JSON schémata bez syntaktických chyb. Model funguje v roli Senior Quantitative Equity Analyst &amp; Head of Portfolio Risk – syntetizuje kurzové chování, fundamentální diskonty k analytickým cílům, časové horizonty kvartálních výsledků a sektorové režimy do rigorózních doporučení.</w:t>
       </w:r>
     </w:p>
     <w:p>
@@ -1388,7 +1388,7 @@
           <w:color w:val="2563EB"/>
           <w:sz w:val="26"/>
         </w:rPr>
-        <w:t>5.4 Automaticky přiřazené katalyzátory (Barevné štítky)</w:t>
+        <w:t>5.4 Automaticky přiřazené katalyzátory (13 institucionálních štítků)</w:t>
       </w:r>
     </w:p>
     <w:p>
@@ -1401,7 +1401,99 @@
           <w:color w:val="1E293B"/>
           <w:sz w:val="21"/>
         </w:rPr>
-        <w:t>Systém kartám automaticky přiřazuje rychlé vizuální štítky na základě matematických filtrů:</w:t>
+        <w:t>Systém kartám přiřazuje až 4 relevantní štítky z přesně definované sady 13 institucionálních katalyzátorů na základě kvantitativních filtrů, firemních kalendářů a výzkumných modelů:</w:t>
+      </w:r>
+    </w:p>
+    <w:p>
+      <w:pPr>
+        <w:pStyle w:val="ListBullet"/>
+        <w:spacing w:before="0" w:after="60" w:line="276" w:lineRule="auto"/>
+      </w:pPr>
+      <w:r>
+        <w:rPr>
+          <w:rFonts w:ascii="Calibri" w:hAnsi="Calibri"/>
+          <w:b/>
+          <w:color w:val="1E293B"/>
+          <w:sz w:val="21"/>
+        </w:rPr>
+        <w:t>⚡ Objemový průraz (LiMT):</w:t>
+      </w:r>
+      <w:r>
+        <w:rPr>
+          <w:rFonts w:ascii="Calibri" w:hAnsi="Calibri"/>
+          <w:color w:val="1E293B"/>
+          <w:sz w:val="21"/>
+        </w:rPr>
+        <w:t xml:space="preserve"> Z-skóre denního objemu z_v &gt;= 2.0σ při růstu ceny; indikuje institucionální akumulaci a růst likvidity (výzkum LiMT).</w:t>
+      </w:r>
+    </w:p>
+    <w:p>
+      <w:pPr>
+        <w:pStyle w:val="ListBullet"/>
+        <w:spacing w:before="0" w:after="60" w:line="276" w:lineRule="auto"/>
+      </w:pPr>
+      <w:r>
+        <w:rPr>
+          <w:rFonts w:ascii="Calibri" w:hAnsi="Calibri"/>
+          <w:b/>
+          <w:color w:val="1E293B"/>
+          <w:sz w:val="21"/>
+        </w:rPr>
+        <w:t>🧠 Sentiment Divergence:</w:t>
+      </w:r>
+      <w:r>
+        <w:rPr>
+          <w:rFonts w:ascii="Calibri" w:hAnsi="Calibri"/>
+          <w:color w:val="1E293B"/>
+          <w:sz w:val="21"/>
+        </w:rPr>
+        <w:t xml:space="preserve"> Tržní kurz konsoliduje (-6 % až +2 %), ale cíl analytiků roste a diskont &gt;= 15 %; skrytá akumulace velkými hráči.</w:t>
+      </w:r>
+    </w:p>
+    <w:p>
+      <w:pPr>
+        <w:pStyle w:val="ListBullet"/>
+        <w:spacing w:before="0" w:after="60" w:line="276" w:lineRule="auto"/>
+      </w:pPr>
+      <w:r>
+        <w:rPr>
+          <w:rFonts w:ascii="Calibri" w:hAnsi="Calibri"/>
+          <w:b/>
+          <w:color w:val="1E293B"/>
+          <w:sz w:val="21"/>
+        </w:rPr>
+        <w:t>⚖️ Sektorový diskont (Pairs):</w:t>
+      </w:r>
+      <w:r>
+        <w:rPr>
+          <w:rFonts w:ascii="Calibri" w:hAnsi="Calibri"/>
+          <w:color w:val="1E293B"/>
+          <w:sz w:val="21"/>
+        </w:rPr>
+        <w:t xml:space="preserve"> Statistická arbitráž v rámci odvětví; aktivum zaostává za sektorovým párem o &gt; 1.5σ historického spreadu.</w:t>
+      </w:r>
+    </w:p>
+    <w:p>
+      <w:pPr>
+        <w:pStyle w:val="ListBullet"/>
+        <w:spacing w:before="0" w:after="60" w:line="276" w:lineRule="auto"/>
+      </w:pPr>
+      <w:r>
+        <w:rPr>
+          <w:rFonts w:ascii="Calibri" w:hAnsi="Calibri"/>
+          <w:b/>
+          <w:color w:val="1E293B"/>
+          <w:sz w:val="21"/>
+        </w:rPr>
+        <w:t>🏛️ Úrokový cyklus (NIM):</w:t>
+      </w:r>
+      <w:r>
+        <w:rPr>
+          <w:rFonts w:ascii="Calibri" w:hAnsi="Calibri"/>
+          <w:color w:val="1E293B"/>
+          <w:sz w:val="21"/>
+        </w:rPr>
+        <w:t xml:space="preserve"> Pozitivní vliv úrokového prostředí a čisté úrokové marže (NIM) na bankovní sektor (zpoždění 15–30 dní).</w:t>
       </w:r>
     </w:p>
     <w:p>
@@ -1424,7 +1516,30 @@
           <w:color w:val="1E293B"/>
           <w:sz w:val="21"/>
         </w:rPr>
-        <w:t xml:space="preserve"> Denní skok ceny o více než +3 %.</w:t>
+        <w:t xml:space="preserve"> Denní skok ceny o více než +3 % podpořený kladným 1M a 3M momentem.</w:t>
+      </w:r>
+    </w:p>
+    <w:p>
+      <w:pPr>
+        <w:pStyle w:val="ListBullet"/>
+        <w:spacing w:before="0" w:after="60" w:line="276" w:lineRule="auto"/>
+      </w:pPr>
+      <w:r>
+        <w:rPr>
+          <w:rFonts w:ascii="Calibri" w:hAnsi="Calibri"/>
+          <w:b/>
+          <w:color w:val="1E293B"/>
+          <w:sz w:val="21"/>
+        </w:rPr>
+        <w:t>📉 Přeprodáno / Korekce:</w:t>
+      </w:r>
+      <w:r>
+        <w:rPr>
+          <w:rFonts w:ascii="Calibri" w:hAnsi="Calibri"/>
+          <w:color w:val="1E293B"/>
+          <w:sz w:val="21"/>
+        </w:rPr>
+        <w:t xml:space="preserve"> Denní pokles o více než -3 % do přeprodané oblasti (příležitost pro dip-buyers při stabilním fundamentu).</w:t>
       </w:r>
     </w:p>
     <w:p>
@@ -1447,7 +1562,7 @@
           <w:color w:val="1E293B"/>
           <w:sz w:val="21"/>
         </w:rPr>
-        <w:t xml:space="preserve"> Titul se dotýká nebo blíží 52týdennímu maximu (býčí síla).</w:t>
+        <w:t xml:space="preserve"> Titul se nachází do 3 % od 52týdenního maxima (cena &gt;= 97 % z 52w High; býčí síla).</w:t>
       </w:r>
     </w:p>
     <w:p>
@@ -1462,7 +1577,7 @@
           <w:color w:val="1E293B"/>
           <w:sz w:val="21"/>
         </w:rPr>
-        <w:t>📉 Přeprodáno / Korekce:</w:t>
+        <w:t>🎯 Vysoký diskont:</w:t>
       </w:r>
       <w:r>
         <w:rPr>
@@ -1470,7 +1585,99 @@
           <w:color w:val="1E293B"/>
           <w:sz w:val="21"/>
         </w:rPr>
-        <w:t xml:space="preserve"> Denní pokles o více než -3 % (oblast pro sledování slev).</w:t>
+        <w:t xml:space="preserve"> Očekávaný růst k průměrnému cíli analytiků &gt; +25 % při alespoň 5 analytických pokrýtích.</w:t>
+      </w:r>
+    </w:p>
+    <w:p>
+      <w:pPr>
+        <w:pStyle w:val="ListBullet"/>
+        <w:spacing w:before="0" w:after="60" w:line="276" w:lineRule="auto"/>
+      </w:pPr>
+      <w:r>
+        <w:rPr>
+          <w:rFonts w:ascii="Calibri" w:hAnsi="Calibri"/>
+          <w:b/>
+          <w:color w:val="1E293B"/>
+          <w:sz w:val="21"/>
+        </w:rPr>
+        <w:t>⚠️ Nad cílem analytiků:</w:t>
+      </w:r>
+      <w:r>
+        <w:rPr>
+          <w:rFonts w:ascii="Calibri" w:hAnsi="Calibri"/>
+          <w:color w:val="1E293B"/>
+          <w:sz w:val="21"/>
+        </w:rPr>
+        <w:t xml:space="preserve"> Aktuální tržní cena překročila konsenzus analytiků z Wall Street; vyčerpaný růstový potenciál.</w:t>
+      </w:r>
+    </w:p>
+    <w:p>
+      <w:pPr>
+        <w:pStyle w:val="ListBullet"/>
+        <w:spacing w:before="0" w:after="60" w:line="276" w:lineRule="auto"/>
+      </w:pPr>
+      <w:r>
+        <w:rPr>
+          <w:rFonts w:ascii="Calibri" w:hAnsi="Calibri"/>
+          <w:b/>
+          <w:color w:val="1E293B"/>
+          <w:sz w:val="21"/>
+        </w:rPr>
+        <w:t>⏳ Výsledky do 7 dní:</w:t>
+      </w:r>
+      <w:r>
+        <w:rPr>
+          <w:rFonts w:ascii="Calibri" w:hAnsi="Calibri"/>
+          <w:color w:val="1E293B"/>
+          <w:sz w:val="21"/>
+        </w:rPr>
+        <w:t xml:space="preserve"> Zveřejnění kvartálních výsledků v horizontu do 7 dnů; vysoká implikovaná volatilita a binární riziko (strop na konfidenci 65 %).</w:t>
+      </w:r>
+    </w:p>
+    <w:p>
+      <w:pPr>
+        <w:pStyle w:val="ListBullet"/>
+        <w:spacing w:before="0" w:after="60" w:line="276" w:lineRule="auto"/>
+      </w:pPr>
+      <w:r>
+        <w:rPr>
+          <w:rFonts w:ascii="Calibri" w:hAnsi="Calibri"/>
+          <w:b/>
+          <w:color w:val="1E293B"/>
+          <w:sz w:val="21"/>
+        </w:rPr>
+        <w:t>📅 Výsledky do 21 dní:</w:t>
+      </w:r>
+      <w:r>
+        <w:rPr>
+          <w:rFonts w:ascii="Calibri" w:hAnsi="Calibri"/>
+          <w:color w:val="1E293B"/>
+          <w:sz w:val="21"/>
+        </w:rPr>
+        <w:t xml:space="preserve"> Kvartální výsledky za 8 až 21 dnů; fáze předvýsledkového run-up akumulačního momenta.</w:t>
+      </w:r>
+    </w:p>
+    <w:p>
+      <w:pPr>
+        <w:pStyle w:val="ListBullet"/>
+        <w:spacing w:before="0" w:after="60" w:line="276" w:lineRule="auto"/>
+      </w:pPr>
+      <w:r>
+        <w:rPr>
+          <w:rFonts w:ascii="Calibri" w:hAnsi="Calibri"/>
+          <w:b/>
+          <w:color w:val="1E293B"/>
+          <w:sz w:val="21"/>
+        </w:rPr>
+        <w:t>💰 Ex-Div za N dní:</w:t>
+      </w:r>
+      <w:r>
+        <w:rPr>
+          <w:rFonts w:ascii="Calibri" w:hAnsi="Calibri"/>
+          <w:color w:val="1E293B"/>
+          <w:sz w:val="21"/>
+        </w:rPr>
+        <w:t xml:space="preserve"> Rozhodný den pro výplatu dividendy (Ex-Dividend) v horizontu 1 až 14 dnů.</w:t>
       </w:r>
     </w:p>
     <w:p>
@@ -1493,30 +1700,7 @@
           <w:color w:val="1E293B"/>
           <w:sz w:val="21"/>
         </w:rPr>
-        <w:t xml:space="preserve"> Titul z pražské burzy s vysokým dividendovým profilem.</w:t>
-      </w:r>
-    </w:p>
-    <w:p>
-      <w:pPr>
-        <w:pStyle w:val="ListBullet"/>
-        <w:spacing w:before="0" w:after="60" w:line="276" w:lineRule="auto"/>
-      </w:pPr>
-      <w:r>
-        <w:rPr>
-          <w:rFonts w:ascii="Calibri" w:hAnsi="Calibri"/>
-          <w:b/>
-          <w:color w:val="1E293B"/>
-          <w:sz w:val="21"/>
-        </w:rPr>
-        <w:t>📊 Pasivní ETF:</w:t>
-      </w:r>
-      <w:r>
-        <w:rPr>
-          <w:rFonts w:ascii="Calibri" w:hAnsi="Calibri"/>
-          <w:color w:val="1E293B"/>
-          <w:sz w:val="21"/>
-        </w:rPr>
-        <w:t xml:space="preserve"> Fond sledující široký tržní index.</w:t>
+        <w:t xml:space="preserve"> Titul z pražské burzy v CZK s vysokým dividendovým výnosem a defenzivním profilem.</w:t>
       </w:r>
     </w:p>
     <w:p>
@@ -1827,7 +2011,7 @@
           <w:color w:val="1E293B"/>
           <w:sz w:val="21"/>
         </w:rPr>
-        <w:t>Aby systém dokázal bleskově zpracovat 541 aktiv bez rizika rate-limitu od poskytovatelů dat, využívá inteligentní souborovou mezipaměť (cache_fundamentals.json) s 24hodinovou expirací. Kalendáře a analytické cíle se tak dotazují jednou denně, zatímco kurzy běží v reálném čase. Všechny předstihové ukazatele jsou navíc přímo předávány do modelu Gemini, který je promítá do generovaného AI kontextu.</w:t>
+        <w:t>Aby systém dokázal bleskově zpracovat 557 aktiv bez rizika rate-limitu od poskytovatelů dat, využívá inteligentní souborovou mezipaměť (cache_fundamentals.json) s 24hodinovou expirací. Kalendáře a analytické cíle se tak dotazují jednou denně, zatímco kurzy běží v reálném čase. Všechny předstihové ukazatele jsou navíc přímo předávány do modelu Google Gemini 3.8 Flash, který je promítá do generovaného AI kontextu.</w:t>
       </w:r>
     </w:p>
     <w:p>
@@ -1878,7 +2062,7 @@
           <w:color w:val="1E293B"/>
           <w:sz w:val="21"/>
         </w:rPr>
-        <w:t xml:space="preserve"> Každý sken vygeneruje kompletní neměnný JSON soubor se všemi 541 kartami, tržními vstupy i AI zdůvodněními.</w:t>
+        <w:t xml:space="preserve"> Každý sken vygeneruje kompletní neměnný JSON soubor se všemi 557 kartami, tržními vstupy i AI zdůvodněními.</w:t>
       </w:r>
     </w:p>
     <w:p>
@@ -2739,7 +2923,7 @@
           <w:color w:val="1E293B"/>
           <w:sz w:val="21"/>
         </w:rPr>
-        <w:t xml:space="preserve"> V záhlaví aplikace i ve filtračním panelu je k dispozici dedikovaná sekce '⚡ Posuny od včerejška'. Investor jedním kliknutím odfiltruje pouze upgrady, downgrady či skoky konfidence a nemusí procházet všech 541 aktiv.</w:t>
+        <w:t xml:space="preserve"> V záhlaví aplikace i ve filtračním panelu je k dispozici dedikovaná sekce '⚡ Posuny od včerejška'. Investor jedním kliknutím odfiltruje pouze upgrady, downgrady či skoky konfidence a nemusí procházet všech 557 aktiv.</w:t>
       </w:r>
     </w:p>
     <w:p>
@@ -3817,7 +4001,7 @@
               <w:rPr>
                 <w:sz w:val="17"/>
               </w:rPr>
-              <w:t>Syntéza v Head of Risk systémovém promptu Gemini 3.5 AI s prioritou událostí.</w:t>
+              <w:t>Syntéza v Head of Risk systémovém promptu Gemini 3.8 Flash AI s prioritou událostí.</w:t>
             </w:r>
           </w:p>
         </w:tc>
@@ -4424,7 +4608,7 @@
               <w:rPr>
                 <w:sz w:val="17"/>
               </w:rPr>
-              <w:t>Pravidlo nepotvrzeného sentimentu v Gemini AI (sentiment vyžaduje technický impuls).</w:t>
+              <w:t>Pravidlo nepotvrzeného sentimentu v Gemini 3.8 Flash AI (sentiment vyžaduje technický impuls).</w:t>
             </w:r>
           </w:p>
         </w:tc>
@@ -4580,7 +4764,475 @@
           <w:color w:val="1E293B"/>
           <w:sz w:val="21"/>
         </w:rPr>
-        <w:t>Na samotném začátku vizuálního rozhraní byl zaveden Kompozitní Makroekonomický Barometr (0 až 100) s vertikální stupnicí, který slouží jako předstihový systém včasného varování před hospodářskou recesí a systémovým krachem trhů. Syntetizuje 5 klíčových institucionálních datových proudů: výnosovou křivku US Treasuries (10Y/3M, 10Y/5Y spread – váha 25 %), úvěrové spready firemních dluhopisů (HYG vs LQD – váha 20 %), volatilitní režim CBOE VIX (váha 20 %), spotřebitelskou poptávku a výrobní cyklus (poměr cyklického a defenzivního koše XLY/XLP a průmysl XLI – váha 20 %) a vnitřní šíři trhu z 557 aktiv univerza SuggestInvest (váha 15 %). Součástí je Sektorový radar recese monitorující 9 odvětví.</w:t>
+        <w:t>Na samotném začátku vizuálního rozhraní byl zaveden Kompozitní Makroekonomický Barometr (0 až 100) s vertikální stupnicí, který slouží jako předstihový systém včasného varování před hospodářskou recesí a systémovým krachem trhů. Engine nepřetržitě vyhodnocuje 5 klíčových institucionálních datových proudů:</w:t>
+      </w:r>
+    </w:p>
+    <w:tbl>
+      <w:tblPr>
+        <w:tblW w:type="auto" w:w="0"/>
+        <w:jc w:val="center"/>
+        <w:tblLayout w:type="fixed"/>
+        <w:tblLook w:firstColumn="1" w:firstRow="1" w:lastColumn="0" w:lastRow="0" w:noHBand="0" w:noVBand="1" w:val="04A0"/>
+      </w:tblPr>
+      <w:tblGrid>
+        <w:gridCol w:w="3120"/>
+        <w:gridCol w:w="3120"/>
+        <w:gridCol w:w="3120"/>
+      </w:tblGrid>
+      <w:tr>
+        <w:tc>
+          <w:tcPr>
+            <w:tcW w:type="dxa" w:w="3120"/>
+            <w:shd w:fill="0f172a"/>
+            <w:tcMar>
+              <w:top w:w="100" w:type="dxa"/>
+              <w:bottom w:w="100" w:type="dxa"/>
+              <w:left w:w="100" w:type="dxa"/>
+              <w:right w:w="100" w:type="dxa"/>
+            </w:tcMar>
+          </w:tcPr>
+          <w:p>
+            <w:pPr>
+              <w:spacing w:after="40"/>
+            </w:pPr>
+            <w:r>
+              <w:rPr>
+                <w:b/>
+                <w:color w:val="FFFFFF"/>
+                <w:sz w:val="18"/>
+              </w:rPr>
+              <w:t>Sub-faktor makro barometru</w:t>
+            </w:r>
+          </w:p>
+        </w:tc>
+        <w:tc>
+          <w:tcPr>
+            <w:tcW w:type="dxa" w:w="3120"/>
+            <w:shd w:fill="0f172a"/>
+            <w:tcMar>
+              <w:top w:w="100" w:type="dxa"/>
+              <w:bottom w:w="100" w:type="dxa"/>
+              <w:left w:w="100" w:type="dxa"/>
+              <w:right w:w="100" w:type="dxa"/>
+            </w:tcMar>
+          </w:tcPr>
+          <w:p>
+            <w:pPr>
+              <w:spacing w:after="40"/>
+            </w:pPr>
+            <w:r>
+              <w:rPr>
+                <w:b/>
+                <w:color w:val="FFFFFF"/>
+                <w:sz w:val="18"/>
+              </w:rPr>
+              <w:t>Váha</w:t>
+            </w:r>
+          </w:p>
+        </w:tc>
+        <w:tc>
+          <w:tcPr>
+            <w:tcW w:type="dxa" w:w="3120"/>
+            <w:shd w:fill="0f172a"/>
+            <w:tcMar>
+              <w:top w:w="100" w:type="dxa"/>
+              <w:bottom w:w="100" w:type="dxa"/>
+              <w:left w:w="100" w:type="dxa"/>
+              <w:right w:w="100" w:type="dxa"/>
+            </w:tcMar>
+          </w:tcPr>
+          <w:p>
+            <w:pPr>
+              <w:spacing w:after="40"/>
+            </w:pPr>
+            <w:r>
+              <w:rPr>
+                <w:b/>
+                <w:color w:val="FFFFFF"/>
+                <w:sz w:val="18"/>
+              </w:rPr>
+              <w:t>Měřené metriky a indikace</w:t>
+            </w:r>
+          </w:p>
+        </w:tc>
+      </w:tr>
+      <w:tr>
+        <w:tc>
+          <w:tcPr>
+            <w:tcW w:type="dxa" w:w="3120"/>
+            <w:shd w:fill="f8fafc"/>
+            <w:tcMar>
+              <w:top w:w="70" w:type="dxa"/>
+              <w:bottom w:w="70" w:type="dxa"/>
+              <w:left w:w="90" w:type="dxa"/>
+              <w:right w:w="90" w:type="dxa"/>
+            </w:tcMar>
+          </w:tcPr>
+          <w:p>
+            <w:pPr>
+              <w:spacing w:after="40"/>
+            </w:pPr>
+            <w:r>
+              <w:rPr>
+                <w:b/>
+                <w:sz w:val="17"/>
+              </w:rPr>
+              <w:t>1. Výnosová křivka US Treasuries</w:t>
+            </w:r>
+          </w:p>
+        </w:tc>
+        <w:tc>
+          <w:tcPr>
+            <w:tcW w:type="dxa" w:w="3120"/>
+            <w:shd w:fill="f8fafc"/>
+            <w:tcMar>
+              <w:top w:w="70" w:type="dxa"/>
+              <w:bottom w:w="70" w:type="dxa"/>
+              <w:left w:w="90" w:type="dxa"/>
+              <w:right w:w="90" w:type="dxa"/>
+            </w:tcMar>
+          </w:tcPr>
+          <w:p>
+            <w:pPr>
+              <w:spacing w:after="40"/>
+            </w:pPr>
+            <w:r>
+              <w:rPr>
+                <w:sz w:val="17"/>
+              </w:rPr>
+              <w:t>25 %</w:t>
+            </w:r>
+          </w:p>
+        </w:tc>
+        <w:tc>
+          <w:tcPr>
+            <w:tcW w:type="dxa" w:w="3120"/>
+            <w:shd w:fill="f8fafc"/>
+            <w:tcMar>
+              <w:top w:w="70" w:type="dxa"/>
+              <w:bottom w:w="70" w:type="dxa"/>
+              <w:left w:w="90" w:type="dxa"/>
+              <w:right w:w="90" w:type="dxa"/>
+            </w:tcMar>
+          </w:tcPr>
+          <w:p>
+            <w:pPr>
+              <w:spacing w:after="40"/>
+            </w:pPr>
+            <w:r>
+              <w:rPr>
+                <w:sz w:val="17"/>
+              </w:rPr>
+              <w:t>Spready 10Y-3M (^TNX vs ^IRX) a 10Y-5Y (^TNX vs ^FVX). Inverze křivky a fáze un-inversion předpovídají recesi se 6–18měsíčním předstihem.</w:t>
+            </w:r>
+          </w:p>
+        </w:tc>
+      </w:tr>
+      <w:tr>
+        <w:tc>
+          <w:tcPr>
+            <w:tcW w:type="dxa" w:w="3120"/>
+            <w:shd w:fill="ffffff"/>
+            <w:tcMar>
+              <w:top w:w="70" w:type="dxa"/>
+              <w:bottom w:w="70" w:type="dxa"/>
+              <w:left w:w="90" w:type="dxa"/>
+              <w:right w:w="90" w:type="dxa"/>
+            </w:tcMar>
+          </w:tcPr>
+          <w:p>
+            <w:pPr>
+              <w:spacing w:after="40"/>
+            </w:pPr>
+            <w:r>
+              <w:rPr>
+                <w:b/>
+                <w:sz w:val="17"/>
+              </w:rPr>
+              <w:t>2. Úvěrové spready firemního dluhu</w:t>
+            </w:r>
+          </w:p>
+        </w:tc>
+        <w:tc>
+          <w:tcPr>
+            <w:tcW w:type="dxa" w:w="3120"/>
+            <w:shd w:fill="ffffff"/>
+            <w:tcMar>
+              <w:top w:w="70" w:type="dxa"/>
+              <w:bottom w:w="70" w:type="dxa"/>
+              <w:left w:w="90" w:type="dxa"/>
+              <w:right w:w="90" w:type="dxa"/>
+            </w:tcMar>
+          </w:tcPr>
+          <w:p>
+            <w:pPr>
+              <w:spacing w:after="40"/>
+            </w:pPr>
+            <w:r>
+              <w:rPr>
+                <w:sz w:val="17"/>
+              </w:rPr>
+              <w:t>20 %</w:t>
+            </w:r>
+          </w:p>
+        </w:tc>
+        <w:tc>
+          <w:tcPr>
+            <w:tcW w:type="dxa" w:w="3120"/>
+            <w:shd w:fill="ffffff"/>
+            <w:tcMar>
+              <w:top w:w="70" w:type="dxa"/>
+              <w:bottom w:w="70" w:type="dxa"/>
+              <w:left w:w="90" w:type="dxa"/>
+              <w:right w:w="90" w:type="dxa"/>
+            </w:tcMar>
+          </w:tcPr>
+          <w:p>
+            <w:pPr>
+              <w:spacing w:after="40"/>
+            </w:pPr>
+            <w:r>
+              <w:rPr>
+                <w:sz w:val="17"/>
+              </w:rPr>
+              <w:t>Poměr high-yield dluhopisů (HYG) vůči kvalitním bonitním dluhopisům (LQD) a poloha vůči 50d SMA. Měří riziko korporátních bankrotů.</w:t>
+            </w:r>
+          </w:p>
+        </w:tc>
+      </w:tr>
+      <w:tr>
+        <w:tc>
+          <w:tcPr>
+            <w:tcW w:type="dxa" w:w="3120"/>
+            <w:shd w:fill="f8fafc"/>
+            <w:tcMar>
+              <w:top w:w="70" w:type="dxa"/>
+              <w:bottom w:w="70" w:type="dxa"/>
+              <w:left w:w="90" w:type="dxa"/>
+              <w:right w:w="90" w:type="dxa"/>
+            </w:tcMar>
+          </w:tcPr>
+          <w:p>
+            <w:pPr>
+              <w:spacing w:after="40"/>
+            </w:pPr>
+            <w:r>
+              <w:rPr>
+                <w:b/>
+                <w:sz w:val="17"/>
+              </w:rPr>
+              <w:t>3. Volatilitní režim CBOE VIX</w:t>
+            </w:r>
+          </w:p>
+        </w:tc>
+        <w:tc>
+          <w:tcPr>
+            <w:tcW w:type="dxa" w:w="3120"/>
+            <w:shd w:fill="f8fafc"/>
+            <w:tcMar>
+              <w:top w:w="70" w:type="dxa"/>
+              <w:bottom w:w="70" w:type="dxa"/>
+              <w:left w:w="90" w:type="dxa"/>
+              <w:right w:w="90" w:type="dxa"/>
+            </w:tcMar>
+          </w:tcPr>
+          <w:p>
+            <w:pPr>
+              <w:spacing w:after="40"/>
+            </w:pPr>
+            <w:r>
+              <w:rPr>
+                <w:sz w:val="17"/>
+              </w:rPr>
+              <w:t>20 %</w:t>
+            </w:r>
+          </w:p>
+        </w:tc>
+        <w:tc>
+          <w:tcPr>
+            <w:tcW w:type="dxa" w:w="3120"/>
+            <w:shd w:fill="f8fafc"/>
+            <w:tcMar>
+              <w:top w:w="70" w:type="dxa"/>
+              <w:bottom w:w="70" w:type="dxa"/>
+              <w:left w:w="90" w:type="dxa"/>
+              <w:right w:w="90" w:type="dxa"/>
+            </w:tcMar>
+          </w:tcPr>
+          <w:p>
+            <w:pPr>
+              <w:spacing w:after="40"/>
+            </w:pPr>
+            <w:r>
+              <w:rPr>
+                <w:sz w:val="17"/>
+              </w:rPr>
+              <w:t>Úroveň indexů ^VIX a ^VXN. Rozlišuje klidný trh (&lt;16), zvýšené napětí (16–22), korekční paniku (23–28) a likviditní krizi (&gt;28).</w:t>
+            </w:r>
+          </w:p>
+        </w:tc>
+      </w:tr>
+      <w:tr>
+        <w:tc>
+          <w:tcPr>
+            <w:tcW w:type="dxa" w:w="3120"/>
+            <w:shd w:fill="ffffff"/>
+            <w:tcMar>
+              <w:top w:w="70" w:type="dxa"/>
+              <w:bottom w:w="70" w:type="dxa"/>
+              <w:left w:w="90" w:type="dxa"/>
+              <w:right w:w="90" w:type="dxa"/>
+            </w:tcMar>
+          </w:tcPr>
+          <w:p>
+            <w:pPr>
+              <w:spacing w:after="40"/>
+            </w:pPr>
+            <w:r>
+              <w:rPr>
+                <w:b/>
+                <w:sz w:val="17"/>
+              </w:rPr>
+              <w:t>4. Poptávkový a výrobní cyklus</w:t>
+            </w:r>
+          </w:p>
+        </w:tc>
+        <w:tc>
+          <w:tcPr>
+            <w:tcW w:type="dxa" w:w="3120"/>
+            <w:shd w:fill="ffffff"/>
+            <w:tcMar>
+              <w:top w:w="70" w:type="dxa"/>
+              <w:bottom w:w="70" w:type="dxa"/>
+              <w:left w:w="90" w:type="dxa"/>
+              <w:right w:w="90" w:type="dxa"/>
+            </w:tcMar>
+          </w:tcPr>
+          <w:p>
+            <w:pPr>
+              <w:spacing w:after="40"/>
+            </w:pPr>
+            <w:r>
+              <w:rPr>
+                <w:sz w:val="17"/>
+              </w:rPr>
+              <w:t>20 %</w:t>
+            </w:r>
+          </w:p>
+        </w:tc>
+        <w:tc>
+          <w:tcPr>
+            <w:tcW w:type="dxa" w:w="3120"/>
+            <w:shd w:fill="ffffff"/>
+            <w:tcMar>
+              <w:top w:w="70" w:type="dxa"/>
+              <w:bottom w:w="70" w:type="dxa"/>
+              <w:left w:w="90" w:type="dxa"/>
+              <w:right w:w="90" w:type="dxa"/>
+            </w:tcMar>
+          </w:tcPr>
+          <w:p>
+            <w:pPr>
+              <w:spacing w:after="40"/>
+            </w:pPr>
+            <w:r>
+              <w:rPr>
+                <w:sz w:val="17"/>
+              </w:rPr>
+              <w:t>Poměr cyklického vs. defenzivního spotřebního koše (XLY/XLP) a relativní hybnost průmyslu (XLI vs SPY). Předstihový signál o chování spotřebitelů.</w:t>
+            </w:r>
+          </w:p>
+        </w:tc>
+      </w:tr>
+      <w:tr>
+        <w:tc>
+          <w:tcPr>
+            <w:tcW w:type="dxa" w:w="3120"/>
+            <w:shd w:fill="f8fafc"/>
+            <w:tcMar>
+              <w:top w:w="70" w:type="dxa"/>
+              <w:bottom w:w="70" w:type="dxa"/>
+              <w:left w:w="90" w:type="dxa"/>
+              <w:right w:w="90" w:type="dxa"/>
+            </w:tcMar>
+          </w:tcPr>
+          <w:p>
+            <w:pPr>
+              <w:spacing w:after="40"/>
+            </w:pPr>
+            <w:r>
+              <w:rPr>
+                <w:b/>
+                <w:sz w:val="17"/>
+              </w:rPr>
+              <w:t>5. Vnitřní šíře univerza (Market Breadth)</w:t>
+            </w:r>
+          </w:p>
+        </w:tc>
+        <w:tc>
+          <w:tcPr>
+            <w:tcW w:type="dxa" w:w="3120"/>
+            <w:shd w:fill="f8fafc"/>
+            <w:tcMar>
+              <w:top w:w="70" w:type="dxa"/>
+              <w:bottom w:w="70" w:type="dxa"/>
+              <w:left w:w="90" w:type="dxa"/>
+              <w:right w:w="90" w:type="dxa"/>
+            </w:tcMar>
+          </w:tcPr>
+          <w:p>
+            <w:pPr>
+              <w:spacing w:after="40"/>
+            </w:pPr>
+            <w:r>
+              <w:rPr>
+                <w:sz w:val="17"/>
+              </w:rPr>
+              <w:t>15 %</w:t>
+            </w:r>
+          </w:p>
+        </w:tc>
+        <w:tc>
+          <w:tcPr>
+            <w:tcW w:type="dxa" w:w="3120"/>
+            <w:shd w:fill="f8fafc"/>
+            <w:tcMar>
+              <w:top w:w="70" w:type="dxa"/>
+              <w:bottom w:w="70" w:type="dxa"/>
+              <w:left w:w="90" w:type="dxa"/>
+              <w:right w:w="90" w:type="dxa"/>
+            </w:tcMar>
+          </w:tcPr>
+          <w:p>
+            <w:pPr>
+              <w:spacing w:after="40"/>
+            </w:pPr>
+            <w:r>
+              <w:rPr>
+                <w:sz w:val="17"/>
+              </w:rPr>
+              <w:t>Procento aktiv nad 50d klouzavým průměrem a poměr prodejních vs nákupních doporučení napříč všemi 557 aktivy SuggestInvest.</w:t>
+            </w:r>
+          </w:p>
+        </w:tc>
+      </w:tr>
+    </w:tbl>
+    <w:p>
+      <w:pPr>
+        <w:spacing w:after="120"/>
+      </w:pPr>
+    </w:p>
+    <w:p>
+      <w:pPr>
+        <w:spacing w:before="0" w:after="120" w:line="276" w:lineRule="auto"/>
+      </w:pPr>
+      <w:r>
+        <w:rPr>
+          <w:rFonts w:ascii="Calibri" w:hAnsi="Calibri"/>
+          <w:color w:val="1E293B"/>
+          <w:sz w:val="21"/>
+        </w:rPr>
+        <w:t>Taktická alokace kapitálu je řízena třístupňovou zónou: Zelená zóna (0–35): Býčí expanze, 100 % alokace; Žlutá zóna (36–65): Pozdní cyklus a varování, krácení nových pozic na 70 % a RRR ≥ 1.8; Červená zóna (66–100): Akutní riziko recese / medvědí trh, maximální alokace 35 %, stop nákupům cyklických akcií a rotace do hotovosti a dividend.</w:t>
       </w:r>
     </w:p>
     <w:p>
@@ -4608,7 +5260,230 @@
           <w:color w:val="1E293B"/>
           <w:sz w:val="21"/>
         </w:rPr>
-        <w:t>Systém disponuje samostatnou dedikovanou stránkou pro autonomní trading (trading.html), přístupnou přímo z horní navigace terminálu. Portál je primárně cílen na institucionálního brokera Interactive Brokers (IBKR) s plnou podporou TWS Socket API (port 7497 Paper / 7496 Live) a jednoklikového exportu do TWS modulu Basket Trader (BasketTrader.csv). Zahrnuje také WebSocket most pro brokera XTB (xAPI). Modul Broker Execution Bridge obsahuje kvantitativní Risk Gatekeeper, který z TOP 5 MVO koše a Strong Buy aktiv automaticky generuje exekučně připravené bracket příkazy (Limit Entry, Stop-Loss, Take-Profit). Pozicování vychází z pevného kapitálového risku (výchozí 1,5 % celkového portfolia na obchod), minimálního poměru zisku k riziku (RRR ≥ 1,8) a makroekonomické ochrany kapitálu, která při zvýšeném riziku recese automaticky krátí alokaci na 50 % nebo blokuje nákupy cyklických titulů. Systém umožňuje okamžité stažení CSV souboru pro TWS Basket Trader, kopírování Python kódu (ib_insync) i bezrizikový Paper Trading Sandbox.</w:t>
+        <w:t>Systém disponuje samostatnou dedikovanou stránkou pro autonomní trading (trading.html), přístupnou přímo z horní navigace terminálu. Portál je primárně cílen na institucionálního brokera Interactive Brokers (IBKR) s plnou podporou TWS Socket API (port 7497 Paper / 7496 Live), IB Client Portal Gateway (port 5000), jednoklikového exportu do TWS modulu Basket Trader (BasketTrader.csv) i WebSocket mostu pro brokera XTB (xAPI).</w:t>
+      </w:r>
+    </w:p>
+    <w:p>
+      <w:pPr>
+        <w:spacing w:before="0" w:after="120" w:line="276" w:lineRule="auto"/>
+      </w:pPr>
+      <w:r>
+        <w:rPr>
+          <w:rFonts w:ascii="Calibri" w:hAnsi="Calibri"/>
+          <w:color w:val="1E293B"/>
+          <w:sz w:val="21"/>
+        </w:rPr>
+        <w:t>A. Autonomní mikroslužba a exekuční REST API (autoinvest_service.py):</w:t>
+      </w:r>
+    </w:p>
+    <w:p>
+      <w:pPr>
+        <w:pStyle w:val="ListBullet"/>
+        <w:spacing w:before="0" w:after="60" w:line="276" w:lineRule="auto"/>
+      </w:pPr>
+      <w:r>
+        <w:rPr>
+          <w:rFonts w:ascii="Calibri" w:hAnsi="Calibri"/>
+          <w:b/>
+          <w:color w:val="1E293B"/>
+          <w:sz w:val="21"/>
+        </w:rPr>
+        <w:t>Lokální REST API:</w:t>
+      </w:r>
+      <w:r>
+        <w:rPr>
+          <w:rFonts w:ascii="Calibri" w:hAnsi="Calibri"/>
+          <w:color w:val="1E293B"/>
+          <w:sz w:val="21"/>
+        </w:rPr>
+        <w:t xml:space="preserve"> Běží na lokálním portu 5001 a poskytuje REST koncové body pro spouštění nákupů, okamžitou kontrolu zůstatků hotovosti a stavu portfolia.</w:t>
+      </w:r>
+    </w:p>
+    <w:p>
+      <w:pPr>
+        <w:pStyle w:val="ListBullet"/>
+        <w:spacing w:before="0" w:after="60" w:line="276" w:lineRule="auto"/>
+      </w:pPr>
+      <w:r>
+        <w:rPr>
+          <w:rFonts w:ascii="Calibri" w:hAnsi="Calibri"/>
+          <w:b/>
+          <w:color w:val="1E293B"/>
+          <w:sz w:val="21"/>
+        </w:rPr>
+        <w:t>Generování Bracket objednávek:</w:t>
+      </w:r>
+      <w:r>
+        <w:rPr>
+          <w:rFonts w:ascii="Calibri" w:hAnsi="Calibri"/>
+          <w:color w:val="1E293B"/>
+          <w:sz w:val="21"/>
+        </w:rPr>
+        <w:t xml:space="preserve"> Automaticky transformuje TOP 5 MVO konvikční koš a Strong Buy tituly na brokerem akceptovatelné JSON příkazy s přesně stanovenou alokací.</w:t>
+      </w:r>
+    </w:p>
+    <w:p>
+      <w:pPr>
+        <w:pStyle w:val="ListBullet"/>
+        <w:spacing w:before="0" w:after="60" w:line="276" w:lineRule="auto"/>
+      </w:pPr>
+      <w:r>
+        <w:rPr>
+          <w:rFonts w:ascii="Calibri" w:hAnsi="Calibri"/>
+          <w:b/>
+          <w:color w:val="1E293B"/>
+          <w:sz w:val="21"/>
+        </w:rPr>
+        <w:t>Autonomní kapitálová rotace (Watcher):</w:t>
+      </w:r>
+      <w:r>
+        <w:rPr>
+          <w:rFonts w:ascii="Calibri" w:hAnsi="Calibri"/>
+          <w:color w:val="1E293B"/>
+          <w:sz w:val="21"/>
+        </w:rPr>
+        <w:t xml:space="preserve"> Průběžný dohled nad otevřenými pozicemi. Při zasažení Take-Profitu nebo Stop-Lossu uvolněnou hotovost okamžitě reinvestuje do dalšího prioritního titulu z nákupní fronty.</w:t>
+      </w:r>
+    </w:p>
+    <w:p>
+      <w:pPr>
+        <w:spacing w:before="0" w:after="120" w:line="276" w:lineRule="auto"/>
+      </w:pPr>
+      <w:r>
+        <w:rPr>
+          <w:rFonts w:ascii="Calibri" w:hAnsi="Calibri"/>
+          <w:color w:val="1E293B"/>
+          <w:sz w:val="21"/>
+        </w:rPr>
+        <w:t>B. Samoopravný dohledový démon (ib_watchdog.py):</w:t>
+      </w:r>
+    </w:p>
+    <w:p>
+      <w:pPr>
+        <w:pStyle w:val="ListBullet"/>
+        <w:spacing w:before="0" w:after="60" w:line="276" w:lineRule="auto"/>
+      </w:pPr>
+      <w:r>
+        <w:rPr>
+          <w:rFonts w:ascii="Calibri" w:hAnsi="Calibri"/>
+          <w:b/>
+          <w:color w:val="1E293B"/>
+          <w:sz w:val="21"/>
+        </w:rPr>
+        <w:t>Heartbeat Keep-Alive:</w:t>
+      </w:r>
+      <w:r>
+        <w:rPr>
+          <w:rFonts w:ascii="Calibri" w:hAnsi="Calibri"/>
+          <w:color w:val="1E293B"/>
+          <w:sz w:val="21"/>
+        </w:rPr>
+        <w:t xml:space="preserve"> Každých 60 sekund odesílá Keep-Alive heartbeat (/v1/api/tickle) na port 5000 Gateway, čímž prodlužuje autentizační relaci a brání odhlášení z nečinnosti.</w:t>
+      </w:r>
+    </w:p>
+    <w:p>
+      <w:pPr>
+        <w:pStyle w:val="ListBullet"/>
+        <w:spacing w:before="0" w:after="60" w:line="276" w:lineRule="auto"/>
+      </w:pPr>
+      <w:r>
+        <w:rPr>
+          <w:rFonts w:ascii="Calibri" w:hAnsi="Calibri"/>
+          <w:b/>
+          <w:color w:val="1E293B"/>
+          <w:sz w:val="21"/>
+        </w:rPr>
+        <w:t>Hlídání procesu:</w:t>
+      </w:r>
+      <w:r>
+        <w:rPr>
+          <w:rFonts w:ascii="Calibri" w:hAnsi="Calibri"/>
+          <w:color w:val="1E293B"/>
+          <w:sz w:val="21"/>
+        </w:rPr>
+        <w:t xml:space="preserve"> Neustále monitoruje dostupnost Gateway. Při výpadku procesu provede automatický restart přes start_ib_gateway.bat.</w:t>
+      </w:r>
+    </w:p>
+    <w:p>
+      <w:pPr>
+        <w:pStyle w:val="ListBullet"/>
+        <w:spacing w:before="0" w:after="60" w:line="276" w:lineRule="auto"/>
+      </w:pPr>
+      <w:r>
+        <w:rPr>
+          <w:rFonts w:ascii="Calibri" w:hAnsi="Calibri"/>
+          <w:b/>
+          <w:color w:val="1E293B"/>
+          <w:sz w:val="21"/>
+        </w:rPr>
+        <w:t>Automatický headless reconnect:</w:t>
+      </w:r>
+      <w:r>
+        <w:rPr>
+          <w:rFonts w:ascii="Calibri" w:hAnsi="Calibri"/>
+          <w:color w:val="1E293B"/>
+          <w:sz w:val="21"/>
+        </w:rPr>
+        <w:t xml:space="preserve"> Při ranním odpojení session (např. pravidelná noční údržba IBKR) automaticky obnoví spojení s využitím přihlašovacích údajů z .env bez nutnosti ručního zadávání či 2FA.</w:t>
+      </w:r>
+    </w:p>
+    <w:p>
+      <w:pPr>
+        <w:spacing w:before="0" w:after="120" w:line="276" w:lineRule="auto"/>
+      </w:pPr>
+      <w:r>
+        <w:rPr>
+          <w:rFonts w:ascii="Calibri" w:hAnsi="Calibri"/>
+          <w:color w:val="1E293B"/>
+          <w:sz w:val="21"/>
+        </w:rPr>
+        <w:t>C. Tichý běh bez oken na Windows:</w:t>
+      </w:r>
+    </w:p>
+    <w:p>
+      <w:pPr>
+        <w:pStyle w:val="ListBullet"/>
+        <w:spacing w:before="0" w:after="60" w:line="276" w:lineRule="auto"/>
+      </w:pPr>
+      <w:r>
+        <w:rPr>
+          <w:rFonts w:ascii="Calibri" w:hAnsi="Calibri"/>
+          <w:b/>
+          <w:color w:val="1E293B"/>
+          <w:sz w:val="21"/>
+        </w:rPr>
+        <w:t>Pozadí bez vyskakovacích oken:</w:t>
+      </w:r>
+      <w:r>
+        <w:rPr>
+          <w:rFonts w:ascii="Calibri" w:hAnsi="Calibri"/>
+          <w:color w:val="1E293B"/>
+          <w:sz w:val="21"/>
+        </w:rPr>
+        <w:t xml:space="preserve"> Pomocí VBScriptů (Spustit_AutoInvest.vbs a Zastavit_AutoInvest.vbs) běží celá dohledová a exekuční infrastruktura zcela skrytě na pozadí operačního systému Windows bez rušivých černých oken příkazové řádky.</w:t>
+      </w:r>
+    </w:p>
+    <w:p>
+      <w:pPr>
+        <w:pStyle w:val="ListBullet"/>
+        <w:spacing w:before="0" w:after="60" w:line="276" w:lineRule="auto"/>
+      </w:pPr>
+      <w:r>
+        <w:rPr>
+          <w:rFonts w:ascii="Calibri" w:hAnsi="Calibri"/>
+          <w:b/>
+          <w:color w:val="1E293B"/>
+          <w:sz w:val="21"/>
+        </w:rPr>
+        <w:t>Centrální spouštěč:</w:t>
+      </w:r>
+      <w:r>
+        <w:rPr>
+          <w:rFonts w:ascii="Calibri" w:hAnsi="Calibri"/>
+          <w:color w:val="1E293B"/>
+          <w:sz w:val="21"/>
+        </w:rPr>
+        <w:t xml:space="preserve"> Skript spustit_vse.bat umožňuje jedním kliknutím uvést do chodu kompletní ekosystém (HTTP webový server, ranní skener trhu i autonomní trading démon).</w:t>
       </w:r>
     </w:p>
     <w:p>
@@ -4805,7 +5680,7 @@
               <w:rPr>
                 <w:sz w:val="17"/>
               </w:rPr>
-              <w:t>48 aktiv</w:t>
+              <w:t>51 aktiv</w:t>
             </w:r>
           </w:p>
         </w:tc>
@@ -4902,7 +5777,7 @@
               <w:rPr>
                 <w:sz w:val="17"/>
               </w:rPr>
-              <w:t>472 aktiv</w:t>
+              <w:t>485 aktiv</w:t>
             </w:r>
           </w:p>
         </w:tc>
@@ -5081,7 +5956,7 @@
           <w:color w:val="1E293B"/>
           <w:sz w:val="21"/>
         </w:rPr>
-        <w:t>Systém SuggestInvest odstraňuje z investičního rozhodování dvě největší slabiny lidského investora: emoční zkreslení a informační zahlcení. Díky spojení reálných tržních dat z XTB, konsenzu analytiků, firemních kalendářů a syntézy modelu Google Gemini dostává investor každé ráno ucelený a forward-looking screening trhu, který mu během několika vteřin ukáže, kde se dnes otevírají nejzajímavější příležitosti.</w:t>
+        <w:t>Systém SuggestInvest odstraňuje z investičního rozhodování dvě největší slabiny lidského investora: emoční zkreslení a informační zahlcení. Díky spojení reálných tržních dat z XTB, konsenzu analytiků, firemních kalendářů, makroekonomického barometru recese, autonomního IBKR &amp; XTB execution enginu a syntézy modelu Google Gemini 3.8 Flash dostává investor každé ráno ucelený a forward-looking screening trhu, který mu během několika vteřin ukáže, kde se dnes otevírají nejzajímavější příležitosti.</w:t>
       </w:r>
     </w:p>
     <w:sectPr>

</xml_diff>